<commit_message>
Lab3: screenshots da Parte 1 (testes + cobertura) no relatório
Adiciona 01-testes, 02-cobertura-repo e 03-cobertura-service; embutidos no
Relatorio_Lab3.docx. Faltam os screenshots das Partes 2 e 3.
</commit_message>
<xml_diff>
--- a/Lab3/Relatorio_Lab3.docx
+++ b/Lab3/Relatorio_Lab3.docx
@@ -4,7 +4,7 @@
   <w:body>
     <w:p>
       <w:pPr>
-        <w:spacing w:after="0" w:before="1800"/>
+        <w:spacing w:before="1800"/>
         <w:jc w:val="center"/>
       </w:pPr>
       <w:r>
@@ -1794,35 +1794,64 @@
     </w:p>
     <w:p>
       <w:pPr>
-        <w:spacing w:after="120" w:before="0"/>
+        <w:spacing w:after="60" w:before="100"/>
+        <w:jc w:val="center"/>
+      </w:pPr>
+      <w:r>
+        <w:drawing>
+          <wp:inline distT="0" distB="0" distL="0" distR="0">
+            <wp:extent cx="5715000" cy="2705100"/>
+            <wp:effectExtent t="0" r="0" b="0" l="0"/>
+            <wp:docPr id="1" name="" descr="" title=""/>
+            <wp:cNvGraphicFramePr>
+              <a:graphicFrameLocks xmlns:a="http://schemas.openxmlformats.org/drawingml/2006/main" noChangeAspect="1"/>
+            </wp:cNvGraphicFramePr>
+            <a:graphic xmlns:a="http://schemas.openxmlformats.org/drawingml/2006/main">
+              <a:graphicData uri="http://schemas.openxmlformats.org/drawingml/2006/picture">
+                <pic:pic xmlns:pic="http://schemas.openxmlformats.org/drawingml/2006/picture">
+                  <pic:nvPicPr>
+                    <pic:cNvPr id="0" name="" descr=""/>
+                    <pic:cNvPicPr>
+                      <a:picLocks noChangeAspect="1" noChangeArrowheads="1"/>
+                    </pic:cNvPicPr>
+                  </pic:nvPicPr>
+                  <pic:blipFill>
+                    <a:blip r:embed="rId7" cstate="none"/>
+                    <a:srcRect/>
+                    <a:stretch>
+                      <a:fillRect/>
+                    </a:stretch>
+                  </pic:blipFill>
+                  <pic:spPr bwMode="auto">
+                    <a:xfrm>
+                      <a:off x="0" y="0"/>
+                      <a:ext cx="5715000" cy="2705100"/>
+                    </a:xfrm>
+                    <a:prstGeom prst="rect">
+                      <a:avLst/>
+                    </a:prstGeom>
+                  </pic:spPr>
+                </pic:pic>
+              </a:graphicData>
+            </a:graphic>
+          </wp:inline>
+        </w:drawing>
+      </w:r>
+    </w:p>
+    <w:p>
+      <w:pPr>
+        <w:spacing w:after="180"/>
+        <w:jc w:val="center"/>
       </w:pPr>
       <w:r>
         <w:rPr>
           <w:i/>
           <w:iCs/>
           <w:color w:val="666666"/>
+          <w:sz w:val="18"/>
+          <w:szCs w:val="18"/>
         </w:rPr>
-        <w:t xml:space="preserve">Tests run: 19, Failures: 0, Errors: 0, Skipped: 0 — BUILD SUCCESS</w:t>
-      </w:r>
-    </w:p>
-    <w:p>
-      <w:pPr>
-        <w:pBdr>
-          <w:top w:val="dashed" w:color="AAAAAA" w:sz="6"/>
-          <w:bottom w:val="dashed" w:color="AAAAAA" w:sz="6"/>
-          <w:left w:val="dashed" w:color="AAAAAA" w:sz="6"/>
-          <w:right w:val="dashed" w:color="AAAAAA" w:sz="6"/>
-        </w:pBdr>
-        <w:spacing w:after="160" w:before="120"/>
-        <w:jc w:val="center"/>
-      </w:pPr>
-      <w:r>
-        <w:rPr>
-          <w:i/>
-          <w:iCs/>
-          <w:color w:val="666666"/>
-        </w:rPr>
-        <w:t xml:space="preserve">[ Screenshot: execução dos testes unitários (mvn test) mostrando "Tests run: 19, Failures: 0" e BUILD SUCCESS ]</w:t>
+        <w:t xml:space="preserve">Figura — execução dos testes unitários (mvn test) — Tests run: 19, Failures: 0, BUILD SUCCESS</w:t>
       </w:r>
     </w:p>
     <w:p>
@@ -2089,6 +2118,300 @@
     </w:p>
     <w:p>
       <w:pPr>
+        <w:spacing w:after="60" w:before="100"/>
+        <w:jc w:val="center"/>
+      </w:pPr>
+      <w:r>
+        <w:drawing>
+          <wp:inline distT="0" distB="0" distL="0" distR="0">
+            <wp:extent cx="5715000" cy="1676400"/>
+            <wp:effectExtent t="0" r="0" b="0" l="0"/>
+            <wp:docPr id="1" name="" descr="" title=""/>
+            <wp:cNvGraphicFramePr>
+              <a:graphicFrameLocks xmlns:a="http://schemas.openxmlformats.org/drawingml/2006/main" noChangeAspect="1"/>
+            </wp:cNvGraphicFramePr>
+            <a:graphic xmlns:a="http://schemas.openxmlformats.org/drawingml/2006/main">
+              <a:graphicData uri="http://schemas.openxmlformats.org/drawingml/2006/picture">
+                <pic:pic xmlns:pic="http://schemas.openxmlformats.org/drawingml/2006/picture">
+                  <pic:nvPicPr>
+                    <pic:cNvPr id="0" name="" descr=""/>
+                    <pic:cNvPicPr>
+                      <a:picLocks noChangeAspect="1" noChangeArrowheads="1"/>
+                    </pic:cNvPicPr>
+                  </pic:nvPicPr>
+                  <pic:blipFill>
+                    <a:blip r:embed="rId8" cstate="none"/>
+                    <a:srcRect/>
+                    <a:stretch>
+                      <a:fillRect/>
+                    </a:stretch>
+                  </pic:blipFill>
+                  <pic:spPr bwMode="auto">
+                    <a:xfrm>
+                      <a:off x="0" y="0"/>
+                      <a:ext cx="5715000" cy="1676400"/>
+                    </a:xfrm>
+                    <a:prstGeom prst="rect">
+                      <a:avLst/>
+                    </a:prstGeom>
+                  </pic:spPr>
+                </pic:pic>
+              </a:graphicData>
+            </a:graphic>
+          </wp:inline>
+        </w:drawing>
+      </w:r>
+    </w:p>
+    <w:p>
+      <w:pPr>
+        <w:spacing w:after="180"/>
+        <w:jc w:val="center"/>
+      </w:pPr>
+      <w:r>
+        <w:rPr>
+          <w:i/>
+          <w:iCs/>
+          <w:color w:val="666666"/>
+          <w:sz w:val="18"/>
+          <w:szCs w:val="18"/>
+        </w:rPr>
+        <w:t xml:space="preserve">Figura — cobertura JaCoCo de InMemoryUserRepository (100%)</w:t>
+      </w:r>
+    </w:p>
+    <w:p>
+      <w:pPr>
+        <w:spacing w:after="60" w:before="100"/>
+        <w:jc w:val="center"/>
+      </w:pPr>
+      <w:r>
+        <w:drawing>
+          <wp:inline distT="0" distB="0" distL="0" distR="0">
+            <wp:extent cx="5715000" cy="1876425"/>
+            <wp:effectExtent t="0" r="0" b="0" l="0"/>
+            <wp:docPr id="1" name="" descr="" title=""/>
+            <wp:cNvGraphicFramePr>
+              <a:graphicFrameLocks xmlns:a="http://schemas.openxmlformats.org/drawingml/2006/main" noChangeAspect="1"/>
+            </wp:cNvGraphicFramePr>
+            <a:graphic xmlns:a="http://schemas.openxmlformats.org/drawingml/2006/main">
+              <a:graphicData uri="http://schemas.openxmlformats.org/drawingml/2006/picture">
+                <pic:pic xmlns:pic="http://schemas.openxmlformats.org/drawingml/2006/picture">
+                  <pic:nvPicPr>
+                    <pic:cNvPr id="0" name="" descr=""/>
+                    <pic:cNvPicPr>
+                      <a:picLocks noChangeAspect="1" noChangeArrowheads="1"/>
+                    </pic:cNvPicPr>
+                  </pic:nvPicPr>
+                  <pic:blipFill>
+                    <a:blip r:embed="rId9" cstate="none"/>
+                    <a:srcRect/>
+                    <a:stretch>
+                      <a:fillRect/>
+                    </a:stretch>
+                  </pic:blipFill>
+                  <pic:spPr bwMode="auto">
+                    <a:xfrm>
+                      <a:off x="0" y="0"/>
+                      <a:ext cx="5715000" cy="1876425"/>
+                    </a:xfrm>
+                    <a:prstGeom prst="rect">
+                      <a:avLst/>
+                    </a:prstGeom>
+                  </pic:spPr>
+                </pic:pic>
+              </a:graphicData>
+            </a:graphic>
+          </wp:inline>
+        </w:drawing>
+      </w:r>
+    </w:p>
+    <w:p>
+      <w:pPr>
+        <w:spacing w:after="180"/>
+        <w:jc w:val="center"/>
+      </w:pPr>
+      <w:r>
+        <w:rPr>
+          <w:i/>
+          <w:iCs/>
+          <w:color w:val="666666"/>
+          <w:sz w:val="18"/>
+          <w:szCs w:val="18"/>
+        </w:rPr>
+        <w:t xml:space="preserve">Figura — cobertura JaCoCo de TodoUserService (100%)</w:t>
+      </w:r>
+    </w:p>
+    <w:p>
+      <w:pPr>
+        <w:pStyle w:val="Heading1"/>
+        <w:spacing w:after="120" w:before="240"/>
+      </w:pPr>
+      <w:r>
+        <w:t xml:space="preserve">4. Parte 2 — Testes de integração</w:t>
+      </w:r>
+    </w:p>
+    <w:p>
+      <w:pPr>
+        <w:pStyle w:val="Heading2"/>
+        <w:spacing w:after="120" w:before="240"/>
+      </w:pPr>
+      <w:r>
+        <w:t xml:space="preserve">4.1. Coleção Postman</w:t>
+      </w:r>
+    </w:p>
+    <w:p>
+      <w:pPr>
+        <w:spacing w:after="120" w:before="0"/>
+      </w:pPr>
+      <w:r>
+        <w:t xml:space="preserve">A coleção fornecida no enunciado (TodoList-phase1.original.json, mantida no repositório para referência) apresentava três problemas que impediam a execução automática:</w:t>
+      </w:r>
+    </w:p>
+    <w:p>
+      <w:pPr>
+        <w:pStyle w:val="ListParagraph"/>
+        <w:numPr>
+          <w:ilvl w:val="0"/>
+          <w:numId w:val="1"/>
+        </w:numPr>
+        <w:spacing w:after="60"/>
+      </w:pPr>
+      <w:r>
+        <w:t xml:space="preserve">As rotas dos itens estavam dessincronizadas da API (/todolist/item em vez de /todo/item);</w:t>
+      </w:r>
+    </w:p>
+    <w:p>
+      <w:pPr>
+        <w:pStyle w:val="ListParagraph"/>
+        <w:numPr>
+          <w:ilvl w:val="0"/>
+          <w:numId w:val="1"/>
+        </w:numPr>
+        <w:spacing w:after="60"/>
+      </w:pPr>
+      <w:r>
+        <w:t xml:space="preserve">Usava localhost, que dentro do contentor Newman refere o próprio contentor;</w:t>
+      </w:r>
+    </w:p>
+    <w:p>
+      <w:pPr>
+        <w:pStyle w:val="ListParagraph"/>
+        <w:numPr>
+          <w:ilvl w:val="0"/>
+          <w:numId w:val="1"/>
+        </w:numPr>
+        <w:spacing w:after="60"/>
+      </w:pPr>
+      <w:r>
+        <w:t xml:space="preserve">Não capturava o token de autenticação para reutilização.</w:t>
+      </w:r>
+    </w:p>
+    <w:p>
+      <w:pPr>
+        <w:spacing w:after="120" w:before="0"/>
+      </w:pPr>
+      <w:r>
+        <w:t xml:space="preserve">Foi por isso criada uma coleção corrigida e estendida, postman.json, que:</w:t>
+      </w:r>
+    </w:p>
+    <w:p>
+      <w:pPr>
+        <w:pStyle w:val="ListParagraph"/>
+        <w:numPr>
+          <w:ilvl w:val="0"/>
+          <w:numId w:val="1"/>
+        </w:numPr>
+        <w:spacing w:after="60"/>
+      </w:pPr>
+      <w:r>
+        <w:t xml:space="preserve">Usa host.docker.internal:7100 (o anfitrião visto de dentro do contentor);</w:t>
+      </w:r>
+    </w:p>
+    <w:p>
+      <w:pPr>
+        <w:pStyle w:val="ListParagraph"/>
+        <w:numPr>
+          <w:ilvl w:val="0"/>
+          <w:numId w:val="1"/>
+        </w:numPr>
+        <w:spacing w:after="60"/>
+      </w:pPr>
+      <w:r>
+        <w:t xml:space="preserve">Captura o token com pm.response.text() — o /login devolve a string "Bearer &lt;username&gt;" em cru (não é JSON), guardada na variável de coleção userToken e reutilizada no header Authorization;</w:t>
+      </w:r>
+    </w:p>
+    <w:p>
+      <w:pPr>
+        <w:pStyle w:val="ListParagraph"/>
+        <w:numPr>
+          <w:ilvl w:val="0"/>
+          <w:numId w:val="1"/>
+        </w:numPr>
+        <w:spacing w:after="60"/>
+      </w:pPr>
+      <w:r>
+        <w:t xml:space="preserve">Contém asserções (pm.test) em cada pedido (código de estado e conteúdo);</w:t>
+      </w:r>
+    </w:p>
+    <w:p>
+      <w:pPr>
+        <w:pStyle w:val="ListParagraph"/>
+        <w:numPr>
+          <w:ilvl w:val="0"/>
+          <w:numId w:val="1"/>
+        </w:numPr>
+        <w:spacing w:after="60"/>
+      </w:pPr>
+      <w:r>
+        <w:t xml:space="preserve">Cobre o fluxo completo, incluindo a funcionalidade nova de marcar-completo.</w:t>
+      </w:r>
+    </w:p>
+    <w:p>
+      <w:pPr>
+        <w:spacing w:after="120" w:before="0"/>
+      </w:pPr>
+      <w:r>
+        <w:t xml:space="preserve">Fluxo (11 pedidos): criar utilizador → login → obter utilizador → criar lista → criar item → listar itens → marcar item completo → confirmar completo → pedido sem token (401) → apagar item → apagar utilizador.</w:t>
+      </w:r>
+    </w:p>
+    <w:p>
+      <w:pPr>
+        <w:pStyle w:val="Heading2"/>
+        <w:spacing w:after="120" w:before="240"/>
+      </w:pPr>
+      <w:r>
+        <w:t xml:space="preserve">4.2. a) Repositório em memória</w:t>
+      </w:r>
+    </w:p>
+    <w:p>
+      <w:pPr>
+        <w:spacing w:after="120" w:before="0"/>
+      </w:pPr>
+      <w:r>
+        <w:t xml:space="preserve">Terminal 1: cd api &amp;&amp; REPO=memory mvn exec:java</w:t>
+      </w:r>
+    </w:p>
+    <w:p>
+      <w:pPr>
+        <w:spacing w:after="120" w:before="0"/>
+      </w:pPr>
+      <w:r>
+        <w:t xml:space="preserve">Terminal 2: cd testes-integracao &amp;&amp; docker run --rm -v "${PWD}":/etc/newman -t postman/newman run postman.json</w:t>
+      </w:r>
+    </w:p>
+    <w:p>
+      <w:pPr>
+        <w:spacing w:after="120" w:before="0"/>
+      </w:pPr>
+      <w:r>
+        <w:rPr>
+          <w:b/>
+          <w:bCs/>
+        </w:rPr>
+        <w:t xml:space="preserve">Resultado: 11 pedidos, 19 asserções, 0 falhas.</w:t>
+      </w:r>
+    </w:p>
+    <w:p>
+      <w:pPr>
         <w:pBdr>
           <w:top w:val="dashed" w:color="AAAAAA" w:sz="6"/>
           <w:bottom w:val="dashed" w:color="AAAAAA" w:sz="6"/>
@@ -2104,16 +2427,23 @@
           <w:iCs/>
           <w:color w:val="666666"/>
         </w:rPr>
-        <w:t xml:space="preserve">[ Screenshot: página do JaCoCo a mostrar 100% de cobertura em InMemoryUserRepository e TodoUserService ]</w:t>
-      </w:r>
-    </w:p>
-    <w:p>
-      <w:pPr>
-        <w:pStyle w:val="Heading1"/>
-        <w:spacing w:after="120" w:before="240"/>
-      </w:pPr>
-      <w:r>
-        <w:t xml:space="preserve">4. Parte 2 — Testes de integração</w:t>
+        <w:t xml:space="preserve">[ Screenshot: saída do Newman no modo memória (requests 11, assertions 19, failed 0) ]</w:t>
+      </w:r>
+    </w:p>
+    <w:p>
+      <w:pPr>
+        <w:spacing w:after="180"/>
+        <w:jc w:val="center"/>
+      </w:pPr>
+      <w:r>
+        <w:rPr>
+          <w:i/>
+          <w:iCs/>
+          <w:color w:val="666666"/>
+          <w:sz w:val="18"/>
+          <w:szCs w:val="18"/>
+        </w:rPr>
+        <w:t xml:space="preserve">Figura — saída do Newman no modo memória (requests 11, assertions 19, failed 0)</w:t>
       </w:r>
     </w:p>
     <w:p>
@@ -2122,7 +2452,7 @@
         <w:spacing w:after="120" w:before="240"/>
       </w:pPr>
       <w:r>
-        <w:t xml:space="preserve">4.1. Coleção Postman</w:t>
+        <w:t xml:space="preserve">4.3. b) Repositório SQL (PostgreSQL)</w:t>
       </w:r>
     </w:p>
     <w:p>
@@ -2130,46 +2460,7 @@
         <w:spacing w:after="120" w:before="0"/>
       </w:pPr>
       <w:r>
-        <w:t xml:space="preserve">A coleção fornecida no enunciado (TodoList-phase1.original.json, mantida no repositório para referência) apresentava três problemas que impediam a execução automática:</w:t>
-      </w:r>
-    </w:p>
-    <w:p>
-      <w:pPr>
-        <w:pStyle w:val="ListParagraph"/>
-        <w:numPr>
-          <w:ilvl w:val="0"/>
-          <w:numId w:val="1"/>
-        </w:numPr>
-        <w:spacing w:after="60"/>
-      </w:pPr>
-      <w:r>
-        <w:t xml:space="preserve">As rotas dos itens estavam dessincronizadas da API (/todolist/item em vez de /todo/item);</w:t>
-      </w:r>
-    </w:p>
-    <w:p>
-      <w:pPr>
-        <w:pStyle w:val="ListParagraph"/>
-        <w:numPr>
-          <w:ilvl w:val="0"/>
-          <w:numId w:val="1"/>
-        </w:numPr>
-        <w:spacing w:after="60"/>
-      </w:pPr>
-      <w:r>
-        <w:t xml:space="preserve">Usava localhost, que dentro do contentor Newman refere o próprio contentor;</w:t>
-      </w:r>
-    </w:p>
-    <w:p>
-      <w:pPr>
-        <w:pStyle w:val="ListParagraph"/>
-        <w:numPr>
-          <w:ilvl w:val="0"/>
-          <w:numId w:val="1"/>
-        </w:numPr>
-        <w:spacing w:after="60"/>
-      </w:pPr>
-      <w:r>
-        <w:t xml:space="preserve">Não capturava o token de autenticação para reutilização.</w:t>
+        <w:t xml:space="preserve">Para o modo SQL usa-se um PostgreSQL em Docker (docker-compose.yml), cujo esquema (initdb/01-schema.sql) é aplicado automaticamente no primeiro arranque. O esquema inclui ON DELETE CASCADE nas chaves estrangeiras, para que o último passo (apagar o utilizador) respeite as tabelas dependentes.</w:t>
       </w:r>
     </w:p>
     <w:p>
@@ -2177,92 +2468,12 @@
         <w:spacing w:after="120" w:before="0"/>
       </w:pPr>
       <w:r>
-        <w:t xml:space="preserve">Foi por isso criada uma coleção corrigida e estendida, postman.json, que:</w:t>
-      </w:r>
-    </w:p>
-    <w:p>
-      <w:pPr>
-        <w:pStyle w:val="ListParagraph"/>
-        <w:numPr>
-          <w:ilvl w:val="0"/>
-          <w:numId w:val="1"/>
-        </w:numPr>
-        <w:spacing w:after="60"/>
-      </w:pPr>
-      <w:r>
-        <w:t xml:space="preserve">Usa host.docker.internal:7100 (o anfitrião visto de dentro do contentor);</w:t>
-      </w:r>
-    </w:p>
-    <w:p>
-      <w:pPr>
-        <w:pStyle w:val="ListParagraph"/>
-        <w:numPr>
-          <w:ilvl w:val="0"/>
-          <w:numId w:val="1"/>
-        </w:numPr>
-        <w:spacing w:after="60"/>
-      </w:pPr>
-      <w:r>
-        <w:t xml:space="preserve">Captura o token com pm.response.text() — o /login devolve a string "Bearer &lt;username&gt;" em cru (não é JSON), guardada na variável de coleção userToken e reutilizada no header Authorization;</w:t>
-      </w:r>
-    </w:p>
-    <w:p>
-      <w:pPr>
-        <w:pStyle w:val="ListParagraph"/>
-        <w:numPr>
-          <w:ilvl w:val="0"/>
-          <w:numId w:val="1"/>
-        </w:numPr>
-        <w:spacing w:after="60"/>
-      </w:pPr>
-      <w:r>
-        <w:t xml:space="preserve">Contém asserções (pm.test) em cada pedido (código de estado e conteúdo);</w:t>
-      </w:r>
-    </w:p>
-    <w:p>
-      <w:pPr>
-        <w:pStyle w:val="ListParagraph"/>
-        <w:numPr>
-          <w:ilvl w:val="0"/>
-          <w:numId w:val="1"/>
-        </w:numPr>
-        <w:spacing w:after="60"/>
-      </w:pPr>
-      <w:r>
-        <w:t xml:space="preserve">Cobre o fluxo completo, incluindo a funcionalidade nova de marcar-completo.</w:t>
-      </w:r>
-    </w:p>
-    <w:p>
-      <w:pPr>
-        <w:spacing w:after="120" w:before="0"/>
-      </w:pPr>
-      <w:r>
-        <w:t xml:space="preserve">Fluxo (11 pedidos): criar utilizador → login → obter utilizador → criar lista → criar item → listar itens → marcar item completo → confirmar completo → pedido sem token (401) → apagar item → apagar utilizador.</w:t>
-      </w:r>
-    </w:p>
-    <w:p>
-      <w:pPr>
-        <w:pStyle w:val="Heading2"/>
-        <w:spacing w:after="120" w:before="240"/>
-      </w:pPr>
-      <w:r>
-        <w:t xml:space="preserve">4.2. a) Repositório em memória</w:t>
-      </w:r>
-    </w:p>
-    <w:p>
-      <w:pPr>
-        <w:spacing w:after="120" w:before="0"/>
-      </w:pPr>
-      <w:r>
-        <w:t xml:space="preserve">Terminal 1: cd api &amp;&amp; REPO=memory mvn exec:java</w:t>
-      </w:r>
-    </w:p>
-    <w:p>
-      <w:pPr>
-        <w:spacing w:after="120" w:before="0"/>
-      </w:pPr>
-      <w:r>
-        <w:t xml:space="preserve">Terminal 2: cd testes-integracao &amp;&amp; docker run --rm -v "${PWD}":/etc/newman -t postman/newman run postman.json</w:t>
+        <w:rPr>
+          <w:i/>
+          <w:iCs/>
+          <w:color w:val="666666"/>
+        </w:rPr>
+        <w:t xml:space="preserve">docker compose up -d  →  (API) REPO=sql mvn exec:java  →  correr o Newman  →  docker compose down -v</w:t>
       </w:r>
     </w:p>
     <w:p>
@@ -2274,7 +2485,7 @@
           <w:b/>
           <w:bCs/>
         </w:rPr>
-        <w:t xml:space="preserve">Resultado: 11 pedidos, 19 asserções, 0 falhas.</w:t>
+        <w:t xml:space="preserve">Resultado: idêntico — 11 pedidos, 19 asserções, 0 falhas, agora persistindo em PostgreSQL. A mesma coleção passar sem alterações nos dois backends demonstra que a camada de repositório está corretamente abstraída.</w:t>
       </w:r>
     </w:p>
     <w:p>
@@ -2294,69 +2505,23 @@
           <w:iCs/>
           <w:color w:val="666666"/>
         </w:rPr>
-        <w:t xml:space="preserve">[ Screenshot: saída do Newman no modo memória (requests 11, assertions 19, failed 0) ]</w:t>
-      </w:r>
-    </w:p>
-    <w:p>
-      <w:pPr>
-        <w:pStyle w:val="Heading2"/>
-        <w:spacing w:after="120" w:before="240"/>
-      </w:pPr>
-      <w:r>
-        <w:t xml:space="preserve">4.3. b) Repositório SQL (PostgreSQL)</w:t>
-      </w:r>
-    </w:p>
-    <w:p>
-      <w:pPr>
-        <w:spacing w:after="120" w:before="0"/>
-      </w:pPr>
-      <w:r>
-        <w:t xml:space="preserve">Para o modo SQL usa-se um PostgreSQL em Docker (docker-compose.yml), cujo esquema (initdb/01-schema.sql) é aplicado automaticamente no primeiro arranque. O esquema inclui ON DELETE CASCADE nas chaves estrangeiras, para que o último passo (apagar o utilizador) respeite as tabelas dependentes (listas e itens).</w:t>
-      </w:r>
-    </w:p>
-    <w:p>
-      <w:pPr>
-        <w:spacing w:after="120" w:before="0"/>
+        <w:t xml:space="preserve">[ Screenshot: saída do Newman no modo SQL/PostgreSQL (requests 11, assertions 19, failed 0) ]</w:t>
+      </w:r>
+    </w:p>
+    <w:p>
+      <w:pPr>
+        <w:spacing w:after="180"/>
+        <w:jc w:val="center"/>
       </w:pPr>
       <w:r>
         <w:rPr>
           <w:i/>
           <w:iCs/>
           <w:color w:val="666666"/>
+          <w:sz w:val="18"/>
+          <w:szCs w:val="18"/>
         </w:rPr>
-        <w:t xml:space="preserve">docker compose up -d  →  (API) REPO=sql mvn exec:java  →  correr o Newman  →  docker compose down -v</w:t>
-      </w:r>
-    </w:p>
-    <w:p>
-      <w:pPr>
-        <w:spacing w:after="120" w:before="0"/>
-      </w:pPr>
-      <w:r>
-        <w:rPr>
-          <w:b/>
-          <w:bCs/>
-        </w:rPr>
-        <w:t xml:space="preserve">Resultado: idêntico — 11 pedidos, 19 asserções, 0 falhas, agora persistindo em PostgreSQL. O facto de a mesma coleção passar sem alterações nos dois backends demonstra que a camada de repositório está corretamente abstraída.</w:t>
-      </w:r>
-    </w:p>
-    <w:p>
-      <w:pPr>
-        <w:pBdr>
-          <w:top w:val="dashed" w:color="AAAAAA" w:sz="6"/>
-          <w:bottom w:val="dashed" w:color="AAAAAA" w:sz="6"/>
-          <w:left w:val="dashed" w:color="AAAAAA" w:sz="6"/>
-          <w:right w:val="dashed" w:color="AAAAAA" w:sz="6"/>
-        </w:pBdr>
-        <w:spacing w:after="160" w:before="120"/>
-        <w:jc w:val="center"/>
-      </w:pPr>
-      <w:r>
-        <w:rPr>
-          <w:i/>
-          <w:iCs/>
-          <w:color w:val="666666"/>
-        </w:rPr>
-        <w:t xml:space="preserve">[ Screenshot: saída do Newman no modo SQL/PostgreSQL (requests 11, assertions 19, failed 0) ]</w:t>
+        <w:t xml:space="preserve">Figura — saída do Newman no modo SQL/PostgreSQL (requests 11, assertions 19, failed 0)</w:t>
       </w:r>
     </w:p>
     <w:p>
@@ -2599,7 +2764,7 @@
         <w:spacing w:after="120" w:before="0"/>
       </w:pPr>
       <w:r>
-        <w:t xml:space="preserve">O endereço da API adapta-se à plataforma: http://localhost:7100 no Desktop e http://10.0.2.2:7100 no emulador Android (onde localhost seria o próprio emulador). O token "Bearer &lt;username&gt;" devolvido pelo login é enviado tal e qual no header Authorization.</w:t>
+        <w:t xml:space="preserve">O endereço da API adapta-se à plataforma: http://localhost:7100 no Desktop e http://10.0.2.2:7100 no emulador Android. O token "Bearer &lt;username&gt;" devolvido pelo login é enviado tal e qual no header Authorization.</w:t>
       </w:r>
     </w:p>
     <w:p>
@@ -2674,7 +2839,23 @@
           <w:iCs/>
           <w:color w:val="666666"/>
         </w:rPr>
-        <w:t xml:space="preserve">[ Screenshot: aplicação a correr em Desktop (macOS) — ecrã de listas/tarefas ]</w:t>
+        <w:t xml:space="preserve">[ Screenshot: aplicação a correr em Desktop (macOS) ]</w:t>
+      </w:r>
+    </w:p>
+    <w:p>
+      <w:pPr>
+        <w:spacing w:after="180"/>
+        <w:jc w:val="center"/>
+      </w:pPr>
+      <w:r>
+        <w:rPr>
+          <w:i/>
+          <w:iCs/>
+          <w:color w:val="666666"/>
+          <w:sz w:val="18"/>
+          <w:szCs w:val="18"/>
+        </w:rPr>
+        <w:t xml:space="preserve">Figura — aplicação a correr em Desktop (macOS)</w:t>
       </w:r>
     </w:p>
     <w:p>
@@ -2699,6 +2880,22 @@
     </w:p>
     <w:p>
       <w:pPr>
+        <w:spacing w:after="180"/>
+        <w:jc w:val="center"/>
+      </w:pPr>
+      <w:r>
+        <w:rPr>
+          <w:i/>
+          <w:iCs/>
+          <w:color w:val="666666"/>
+          <w:sz w:val="18"/>
+          <w:szCs w:val="18"/>
+        </w:rPr>
+        <w:t xml:space="preserve">Figura — aplicação a correr em Android (emulador)</w:t>
+      </w:r>
+    </w:p>
+    <w:p>
+      <w:pPr>
         <w:pStyle w:val="Heading2"/>
         <w:spacing w:after="120" w:before="240"/>
       </w:pPr>
@@ -2724,7 +2921,7 @@
         <w:spacing w:after="60"/>
       </w:pPr>
       <w:r>
-        <w:t xml:space="preserve">API: novos endpoints PUT /todo/{listId}/tasks/{taskId}/complete e /incomplete. O TodoController verifica a posse da lista, e o TodoService.setCompleted(...) altera o campo completed do item e persiste-o via TodoRepository.update(...) (implementado tanto no repositório em memória como no SQL).</w:t>
+        <w:t xml:space="preserve">API: novos endpoints PUT /todo/{listId}/tasks/{taskId}/complete e /incomplete. O TodoController verifica a posse da lista, e o TodoService.setCompleted(...) altera o campo completed e persiste via TodoRepository.update(...) (memória e SQL).</w:t>
       </w:r>
     </w:p>
     <w:p>
@@ -2757,7 +2954,23 @@
           <w:iCs/>
           <w:color w:val="666666"/>
         </w:rPr>
-        <w:t xml:space="preserve">[ Screenshot: tarefa marcada como completa no cliente Flutter (checkbox ativa, texto riscado) ]</w:t>
+        <w:t xml:space="preserve">[ Screenshot: tarefa marcada como completa no cliente Flutter ]</w:t>
+      </w:r>
+    </w:p>
+    <w:p>
+      <w:pPr>
+        <w:spacing w:after="180"/>
+        <w:jc w:val="center"/>
+      </w:pPr>
+      <w:r>
+        <w:rPr>
+          <w:i/>
+          <w:iCs/>
+          <w:color w:val="666666"/>
+          <w:sz w:val="18"/>
+          <w:szCs w:val="18"/>
+        </w:rPr>
+        <w:t xml:space="preserve">Figura — tarefa marcada como completa no cliente Flutter</w:t>
       </w:r>
     </w:p>
     <w:p>

</xml_diff>

<commit_message>
Lab3: screenshots da Parte 2 (Newman memória + SQL) no relatório
</commit_message>
<xml_diff>
--- a/Lab3/Relatorio_Lab3.docx
+++ b/Lab3/Relatorio_Lab3.docx
@@ -2412,22 +2412,48 @@
     </w:p>
     <w:p>
       <w:pPr>
-        <w:pBdr>
-          <w:top w:val="dashed" w:color="AAAAAA" w:sz="6"/>
-          <w:bottom w:val="dashed" w:color="AAAAAA" w:sz="6"/>
-          <w:left w:val="dashed" w:color="AAAAAA" w:sz="6"/>
-          <w:right w:val="dashed" w:color="AAAAAA" w:sz="6"/>
-        </w:pBdr>
-        <w:spacing w:after="160" w:before="120"/>
+        <w:spacing w:after="60" w:before="100"/>
         <w:jc w:val="center"/>
       </w:pPr>
       <w:r>
-        <w:rPr>
-          <w:i/>
-          <w:iCs/>
-          <w:color w:val="666666"/>
-        </w:rPr>
-        <w:t xml:space="preserve">[ Screenshot: saída do Newman no modo memória (requests 11, assertions 19, failed 0) ]</w:t>
+        <w:drawing>
+          <wp:inline distT="0" distB="0" distL="0" distR="0">
+            <wp:extent cx="5715000" cy="3733800"/>
+            <wp:effectExtent t="0" r="0" b="0" l="0"/>
+            <wp:docPr id="1" name="" descr="" title=""/>
+            <wp:cNvGraphicFramePr>
+              <a:graphicFrameLocks xmlns:a="http://schemas.openxmlformats.org/drawingml/2006/main" noChangeAspect="1"/>
+            </wp:cNvGraphicFramePr>
+            <a:graphic xmlns:a="http://schemas.openxmlformats.org/drawingml/2006/main">
+              <a:graphicData uri="http://schemas.openxmlformats.org/drawingml/2006/picture">
+                <pic:pic xmlns:pic="http://schemas.openxmlformats.org/drawingml/2006/picture">
+                  <pic:nvPicPr>
+                    <pic:cNvPr id="0" name="" descr=""/>
+                    <pic:cNvPicPr>
+                      <a:picLocks noChangeAspect="1" noChangeArrowheads="1"/>
+                    </pic:cNvPicPr>
+                  </pic:nvPicPr>
+                  <pic:blipFill>
+                    <a:blip r:embed="rId10" cstate="none"/>
+                    <a:srcRect/>
+                    <a:stretch>
+                      <a:fillRect/>
+                    </a:stretch>
+                  </pic:blipFill>
+                  <pic:spPr bwMode="auto">
+                    <a:xfrm>
+                      <a:off x="0" y="0"/>
+                      <a:ext cx="5715000" cy="3733800"/>
+                    </a:xfrm>
+                    <a:prstGeom prst="rect">
+                      <a:avLst/>
+                    </a:prstGeom>
+                  </pic:spPr>
+                </pic:pic>
+              </a:graphicData>
+            </a:graphic>
+          </wp:inline>
+        </w:drawing>
       </w:r>
     </w:p>
     <w:p>
@@ -2490,22 +2516,48 @@
     </w:p>
     <w:p>
       <w:pPr>
-        <w:pBdr>
-          <w:top w:val="dashed" w:color="AAAAAA" w:sz="6"/>
-          <w:bottom w:val="dashed" w:color="AAAAAA" w:sz="6"/>
-          <w:left w:val="dashed" w:color="AAAAAA" w:sz="6"/>
-          <w:right w:val="dashed" w:color="AAAAAA" w:sz="6"/>
-        </w:pBdr>
-        <w:spacing w:after="160" w:before="120"/>
+        <w:spacing w:after="60" w:before="100"/>
         <w:jc w:val="center"/>
       </w:pPr>
       <w:r>
-        <w:rPr>
-          <w:i/>
-          <w:iCs/>
-          <w:color w:val="666666"/>
-        </w:rPr>
-        <w:t xml:space="preserve">[ Screenshot: saída do Newman no modo SQL/PostgreSQL (requests 11, assertions 19, failed 0) ]</w:t>
+        <w:drawing>
+          <wp:inline distT="0" distB="0" distL="0" distR="0">
+            <wp:extent cx="5715000" cy="3771900"/>
+            <wp:effectExtent t="0" r="0" b="0" l="0"/>
+            <wp:docPr id="1" name="" descr="" title=""/>
+            <wp:cNvGraphicFramePr>
+              <a:graphicFrameLocks xmlns:a="http://schemas.openxmlformats.org/drawingml/2006/main" noChangeAspect="1"/>
+            </wp:cNvGraphicFramePr>
+            <a:graphic xmlns:a="http://schemas.openxmlformats.org/drawingml/2006/main">
+              <a:graphicData uri="http://schemas.openxmlformats.org/drawingml/2006/picture">
+                <pic:pic xmlns:pic="http://schemas.openxmlformats.org/drawingml/2006/picture">
+                  <pic:nvPicPr>
+                    <pic:cNvPr id="0" name="" descr=""/>
+                    <pic:cNvPicPr>
+                      <a:picLocks noChangeAspect="1" noChangeArrowheads="1"/>
+                    </pic:cNvPicPr>
+                  </pic:nvPicPr>
+                  <pic:blipFill>
+                    <a:blip r:embed="rId11" cstate="none"/>
+                    <a:srcRect/>
+                    <a:stretch>
+                      <a:fillRect/>
+                    </a:stretch>
+                  </pic:blipFill>
+                  <pic:spPr bwMode="auto">
+                    <a:xfrm>
+                      <a:off x="0" y="0"/>
+                      <a:ext cx="5715000" cy="3771900"/>
+                    </a:xfrm>
+                    <a:prstGeom prst="rect">
+                      <a:avLst/>
+                    </a:prstGeom>
+                  </pic:spPr>
+                </pic:pic>
+              </a:graphicData>
+            </a:graphic>
+          </wp:inline>
+        </w:drawing>
       </w:r>
     </w:p>
     <w:p>

</xml_diff>

<commit_message>
Lab3: docx regenerado com screenshots Desktop+completa (7/8 imagens)
</commit_message>
<xml_diff>
--- a/Lab3/Relatorio_Lab3.docx
+++ b/Lab3/Relatorio_Lab3.docx
@@ -2876,6 +2876,68 @@
     </w:p>
     <w:p>
       <w:pPr>
+        <w:spacing w:after="60" w:before="100"/>
+        <w:jc w:val="center"/>
+      </w:pPr>
+      <w:r>
+        <w:drawing>
+          <wp:inline distT="0" distB="0" distL="0" distR="0">
+            <wp:extent cx="5715000" cy="4533900"/>
+            <wp:effectExtent t="0" r="0" b="0" l="0"/>
+            <wp:docPr id="1" name="" descr="" title=""/>
+            <wp:cNvGraphicFramePr>
+              <a:graphicFrameLocks xmlns:a="http://schemas.openxmlformats.org/drawingml/2006/main" noChangeAspect="1"/>
+            </wp:cNvGraphicFramePr>
+            <a:graphic xmlns:a="http://schemas.openxmlformats.org/drawingml/2006/main">
+              <a:graphicData uri="http://schemas.openxmlformats.org/drawingml/2006/picture">
+                <pic:pic xmlns:pic="http://schemas.openxmlformats.org/drawingml/2006/picture">
+                  <pic:nvPicPr>
+                    <pic:cNvPr id="0" name="" descr=""/>
+                    <pic:cNvPicPr>
+                      <a:picLocks noChangeAspect="1" noChangeArrowheads="1"/>
+                    </pic:cNvPicPr>
+                  </pic:nvPicPr>
+                  <pic:blipFill>
+                    <a:blip r:embed="rId12" cstate="none"/>
+                    <a:srcRect/>
+                    <a:stretch>
+                      <a:fillRect/>
+                    </a:stretch>
+                  </pic:blipFill>
+                  <pic:spPr bwMode="auto">
+                    <a:xfrm>
+                      <a:off x="0" y="0"/>
+                      <a:ext cx="5715000" cy="4533900"/>
+                    </a:xfrm>
+                    <a:prstGeom prst="rect">
+                      <a:avLst/>
+                    </a:prstGeom>
+                  </pic:spPr>
+                </pic:pic>
+              </a:graphicData>
+            </a:graphic>
+          </wp:inline>
+        </w:drawing>
+      </w:r>
+    </w:p>
+    <w:p>
+      <w:pPr>
+        <w:spacing w:after="180"/>
+        <w:jc w:val="center"/>
+      </w:pPr>
+      <w:r>
+        <w:rPr>
+          <w:i/>
+          <w:iCs/>
+          <w:color w:val="666666"/>
+          <w:sz w:val="18"/>
+          <w:szCs w:val="18"/>
+        </w:rPr>
+        <w:t xml:space="preserve">Figura — aplicação a correr em Desktop (macOS)</w:t>
+      </w:r>
+    </w:p>
+    <w:p>
+      <w:pPr>
         <w:pBdr>
           <w:top w:val="dashed" w:color="AAAAAA" w:sz="6"/>
           <w:bottom w:val="dashed" w:color="AAAAAA" w:sz="6"/>
@@ -2891,42 +2953,6 @@
           <w:iCs/>
           <w:color w:val="666666"/>
         </w:rPr>
-        <w:t xml:space="preserve">[ Screenshot: aplicação a correr em Desktop (macOS) ]</w:t>
-      </w:r>
-    </w:p>
-    <w:p>
-      <w:pPr>
-        <w:spacing w:after="180"/>
-        <w:jc w:val="center"/>
-      </w:pPr>
-      <w:r>
-        <w:rPr>
-          <w:i/>
-          <w:iCs/>
-          <w:color w:val="666666"/>
-          <w:sz w:val="18"/>
-          <w:szCs w:val="18"/>
-        </w:rPr>
-        <w:t xml:space="preserve">Figura — aplicação a correr em Desktop (macOS)</w:t>
-      </w:r>
-    </w:p>
-    <w:p>
-      <w:pPr>
-        <w:pBdr>
-          <w:top w:val="dashed" w:color="AAAAAA" w:sz="6"/>
-          <w:bottom w:val="dashed" w:color="AAAAAA" w:sz="6"/>
-          <w:left w:val="dashed" w:color="AAAAAA" w:sz="6"/>
-          <w:right w:val="dashed" w:color="AAAAAA" w:sz="6"/>
-        </w:pBdr>
-        <w:spacing w:after="160" w:before="120"/>
-        <w:jc w:val="center"/>
-      </w:pPr>
-      <w:r>
-        <w:rPr>
-          <w:i/>
-          <w:iCs/>
-          <w:color w:val="666666"/>
-        </w:rPr>
         <w:t xml:space="preserve">[ Screenshot: aplicação a correr em Android (emulador) ]</w:t>
       </w:r>
     </w:p>
@@ -2991,22 +3017,48 @@
     </w:p>
     <w:p>
       <w:pPr>
-        <w:pBdr>
-          <w:top w:val="dashed" w:color="AAAAAA" w:sz="6"/>
-          <w:bottom w:val="dashed" w:color="AAAAAA" w:sz="6"/>
-          <w:left w:val="dashed" w:color="AAAAAA" w:sz="6"/>
-          <w:right w:val="dashed" w:color="AAAAAA" w:sz="6"/>
-        </w:pBdr>
-        <w:spacing w:after="160" w:before="120"/>
+        <w:spacing w:after="60" w:before="100"/>
         <w:jc w:val="center"/>
       </w:pPr>
       <w:r>
-        <w:rPr>
-          <w:i/>
-          <w:iCs/>
-          <w:color w:val="666666"/>
-        </w:rPr>
-        <w:t xml:space="preserve">[ Screenshot: tarefa marcada como completa no cliente Flutter ]</w:t>
+        <w:drawing>
+          <wp:inline distT="0" distB="0" distL="0" distR="0">
+            <wp:extent cx="5715000" cy="4543425"/>
+            <wp:effectExtent t="0" r="0" b="0" l="0"/>
+            <wp:docPr id="1" name="" descr="" title=""/>
+            <wp:cNvGraphicFramePr>
+              <a:graphicFrameLocks xmlns:a="http://schemas.openxmlformats.org/drawingml/2006/main" noChangeAspect="1"/>
+            </wp:cNvGraphicFramePr>
+            <a:graphic xmlns:a="http://schemas.openxmlformats.org/drawingml/2006/main">
+              <a:graphicData uri="http://schemas.openxmlformats.org/drawingml/2006/picture">
+                <pic:pic xmlns:pic="http://schemas.openxmlformats.org/drawingml/2006/picture">
+                  <pic:nvPicPr>
+                    <pic:cNvPr id="0" name="" descr=""/>
+                    <pic:cNvPicPr>
+                      <a:picLocks noChangeAspect="1" noChangeArrowheads="1"/>
+                    </pic:cNvPicPr>
+                  </pic:nvPicPr>
+                  <pic:blipFill>
+                    <a:blip r:embed="rId13" cstate="none"/>
+                    <a:srcRect/>
+                    <a:stretch>
+                      <a:fillRect/>
+                    </a:stretch>
+                  </pic:blipFill>
+                  <pic:spPr bwMode="auto">
+                    <a:xfrm>
+                      <a:off x="0" y="0"/>
+                      <a:ext cx="5715000" cy="4543425"/>
+                    </a:xfrm>
+                    <a:prstGeom prst="rect">
+                      <a:avLst/>
+                    </a:prstGeom>
+                  </pic:spPr>
+                </pic:pic>
+              </a:graphicData>
+            </a:graphic>
+          </wp:inline>
+        </w:drawing>
       </w:r>
     </w:p>
     <w:p>

</xml_diff>

<commit_message>
Lab3: relatório completo — 9 screenshots (Desktop + iPhone físico iOS)
Parte 3 testada em macOS e num iPhone real (login via IP da rede local,
marcar-completo demonstrado nas duas plataformas). Notas de configuração
iOS (ATS) e Android (cleartext) documentadas.
</commit_message>
<xml_diff>
--- a/Lab3/Relatorio_Lab3.docx
+++ b/Lab3/Relatorio_Lab3.docx
@@ -2816,7 +2816,7 @@
         <w:spacing w:after="120" w:before="0"/>
       </w:pPr>
       <w:r>
-        <w:t xml:space="preserve">O endereço da API adapta-se à plataforma: http://localhost:7100 no Desktop e http://10.0.2.2:7100 no emulador Android. O token "Bearer &lt;username&gt;" devolvido pelo login é enviado tal e qual no header Authorization.</w:t>
+        <w:t xml:space="preserve">O endereço da API adapta-se à plataforma: http://localhost:7100 no Desktop, http://10.0.2.2:7100 no emulador Android, e o IP do anfitrião na rede local num dispositivo físico (campo "Servidor" editável no login). O token "Bearer &lt;username&gt;" devolvido pelo login é enviado tal e qual no header Authorization.</w:t>
       </w:r>
     </w:p>
     <w:p>
@@ -2825,7 +2825,7 @@
         <w:spacing w:after="120" w:before="240"/>
       </w:pPr>
       <w:r>
-        <w:t xml:space="preserve">5.2. a) Execução em Android e Desktop</w:t>
+        <w:t xml:space="preserve">5.2. a) Execução em Desktop e em dispositivo móvel</w:t>
       </w:r>
     </w:p>
     <w:p>
@@ -2833,7 +2833,15 @@
         <w:spacing w:after="120" w:before="0"/>
       </w:pPr>
       <w:r>
-        <w:t xml:space="preserve">Preparação (uma vez): flutter pub get e flutter create --platforms=android,macos . Execução: flutter run -d macos (Desktop) ou flutter run -d &lt;emulador&gt; (Android).</w:t>
+        <w:t xml:space="preserve">Preparação (uma vez): flutter pub get e flutter create --platforms=android,ios,macos . Execução: flutter run -d macos (Desktop) ou flutter run -d &lt;dispositivo&gt; (móvel).</w:t>
+      </w:r>
+    </w:p>
+    <w:p>
+      <w:pPr>
+        <w:spacing w:after="120" w:before="0"/>
+      </w:pPr>
+      <w:r>
+        <w:t xml:space="preserve">A aplicação foi testada em Desktop (macOS) e num iPhone físico (iOS), ligado por cabo e assinado via Xcode (Automatically manage signing). No iPhone, o campo "Servidor" foi apontado ao IP do Mac na rede local (http://192.168.1.64:7100), com ambos os equipamentos na mesma rede Wi-Fi. O runner Android está igualmente incluído e configurado no projeto (o emulador Android não foi executado por limitação de tempo na preparação do ambiente; o dispositivo iOS físico demonstra o mesmo objetivo multiplataforma em mobile).</w:t>
       </w:r>
     </w:p>
     <w:p>
@@ -2871,7 +2879,20 @@
         <w:spacing w:after="60"/>
       </w:pPr>
       <w:r>
-        <w:t xml:space="preserve">Android: como a API de teste é HTTP (não HTTPS), é necessário android:usesCleartextTraffic="true" no AndroidManifest.xml.</w:t>
+        <w:t xml:space="preserve">iOS: o iOS bloqueia HTTP em claro (App Transport Security); foi adicionado NSAllowsArbitraryLoads ao ios/Runner/Info.plist (apenas para testes locais).</w:t>
+      </w:r>
+    </w:p>
+    <w:p>
+      <w:pPr>
+        <w:pStyle w:val="ListParagraph"/>
+        <w:numPr>
+          <w:ilvl w:val="0"/>
+          <w:numId w:val="1"/>
+        </w:numPr>
+        <w:spacing w:after="60"/>
+      </w:pPr>
+      <w:r>
+        <w:t xml:space="preserve">Android: como a API de teste é HTTP (não HTTPS), é necessário android:usesCleartextTraffic="true" no AndroidManifest.xml (já aplicado).</w:t>
       </w:r>
     </w:p>
     <w:p>
@@ -2938,92 +2959,13 @@
     </w:p>
     <w:p>
       <w:pPr>
-        <w:pBdr>
-          <w:top w:val="dashed" w:color="AAAAAA" w:sz="6"/>
-          <w:bottom w:val="dashed" w:color="AAAAAA" w:sz="6"/>
-          <w:left w:val="dashed" w:color="AAAAAA" w:sz="6"/>
-          <w:right w:val="dashed" w:color="AAAAAA" w:sz="6"/>
-        </w:pBdr>
-        <w:spacing w:after="160" w:before="120"/>
-        <w:jc w:val="center"/>
-      </w:pPr>
-      <w:r>
-        <w:rPr>
-          <w:i/>
-          <w:iCs/>
-          <w:color w:val="666666"/>
-        </w:rPr>
-        <w:t xml:space="preserve">[ Screenshot: aplicação a correr em Android (emulador) ]</w:t>
-      </w:r>
-    </w:p>
-    <w:p>
-      <w:pPr>
-        <w:spacing w:after="180"/>
-        <w:jc w:val="center"/>
-      </w:pPr>
-      <w:r>
-        <w:rPr>
-          <w:i/>
-          <w:iCs/>
-          <w:color w:val="666666"/>
-          <w:sz w:val="18"/>
-          <w:szCs w:val="18"/>
-        </w:rPr>
-        <w:t xml:space="preserve">Figura — aplicação a correr em Android (emulador)</w:t>
-      </w:r>
-    </w:p>
-    <w:p>
-      <w:pPr>
-        <w:pStyle w:val="Heading2"/>
-        <w:spacing w:after="120" w:before="240"/>
-      </w:pPr>
-      <w:r>
-        <w:t xml:space="preserve">5.3. b) Marcar tarefas como completas (API + cliente)</w:t>
-      </w:r>
-    </w:p>
-    <w:p>
-      <w:pPr>
-        <w:spacing w:after="120" w:before="0"/>
-      </w:pPr>
-      <w:r>
-        <w:t xml:space="preserve">A funcionalidade foi implementada em toda a stack:</w:t>
-      </w:r>
-    </w:p>
-    <w:p>
-      <w:pPr>
-        <w:pStyle w:val="ListParagraph"/>
-        <w:numPr>
-          <w:ilvl w:val="0"/>
-          <w:numId w:val="1"/>
-        </w:numPr>
-        <w:spacing w:after="60"/>
-      </w:pPr>
-      <w:r>
-        <w:t xml:space="preserve">API: novos endpoints PUT /todo/{listId}/tasks/{taskId}/complete e /incomplete. O TodoController verifica a posse da lista, e o TodoService.setCompleted(...) altera o campo completed e persiste via TodoRepository.update(...) (memória e SQL).</w:t>
-      </w:r>
-    </w:p>
-    <w:p>
-      <w:pPr>
-        <w:pStyle w:val="ListParagraph"/>
-        <w:numPr>
-          <w:ilvl w:val="0"/>
-          <w:numId w:val="1"/>
-        </w:numPr>
-        <w:spacing w:after="60"/>
-      </w:pPr>
-      <w:r>
-        <w:t xml:space="preserve">Cliente: cada tarefa é apresentada com uma checkbox (CheckboxListTile); ao alterá-la, o ApiClient.setCompleted(...) é chamado e a lista é recarregada, mostrando o item riscado quando completo.</w:t>
-      </w:r>
-    </w:p>
-    <w:p>
-      <w:pPr>
         <w:spacing w:after="60" w:before="100"/>
         <w:jc w:val="center"/>
       </w:pPr>
       <w:r>
         <w:drawing>
           <wp:inline distT="0" distB="0" distL="0" distR="0">
-            <wp:extent cx="5715000" cy="4543425"/>
+            <wp:extent cx="5715000" cy="12411075"/>
             <wp:effectExtent t="0" r="0" b="0" l="0"/>
             <wp:docPr id="1" name="" descr="" title=""/>
             <wp:cNvGraphicFramePr>
@@ -3048,6 +2990,111 @@
                   <pic:spPr bwMode="auto">
                     <a:xfrm>
                       <a:off x="0" y="0"/>
+                      <a:ext cx="5715000" cy="12411075"/>
+                    </a:xfrm>
+                    <a:prstGeom prst="rect">
+                      <a:avLst/>
+                    </a:prstGeom>
+                  </pic:spPr>
+                </pic:pic>
+              </a:graphicData>
+            </a:graphic>
+          </wp:inline>
+        </w:drawing>
+      </w:r>
+    </w:p>
+    <w:p>
+      <w:pPr>
+        <w:spacing w:after="180"/>
+        <w:jc w:val="center"/>
+      </w:pPr>
+      <w:r>
+        <w:rPr>
+          <w:i/>
+          <w:iCs/>
+          <w:color w:val="666666"/>
+          <w:sz w:val="18"/>
+          <w:szCs w:val="18"/>
+        </w:rPr>
+        <w:t xml:space="preserve">Figura — login no iPhone físico, com o servidor apontado ao IP do Mac na rede local</w:t>
+      </w:r>
+    </w:p>
+    <w:p>
+      <w:pPr>
+        <w:pStyle w:val="Heading2"/>
+        <w:spacing w:after="120" w:before="240"/>
+      </w:pPr>
+      <w:r>
+        <w:t xml:space="preserve">5.3. b) Marcar tarefas como completas (API + cliente)</w:t>
+      </w:r>
+    </w:p>
+    <w:p>
+      <w:pPr>
+        <w:spacing w:after="120" w:before="0"/>
+      </w:pPr>
+      <w:r>
+        <w:t xml:space="preserve">A funcionalidade foi implementada em toda a stack:</w:t>
+      </w:r>
+    </w:p>
+    <w:p>
+      <w:pPr>
+        <w:pStyle w:val="ListParagraph"/>
+        <w:numPr>
+          <w:ilvl w:val="0"/>
+          <w:numId w:val="1"/>
+        </w:numPr>
+        <w:spacing w:after="60"/>
+      </w:pPr>
+      <w:r>
+        <w:t xml:space="preserve">API: novos endpoints PUT /todo/{listId}/tasks/{taskId}/complete e /incomplete. O TodoController verifica a posse da lista, e o TodoService.setCompleted(...) altera o campo completed e persiste via TodoRepository.update(...) (memória e SQL).</w:t>
+      </w:r>
+    </w:p>
+    <w:p>
+      <w:pPr>
+        <w:pStyle w:val="ListParagraph"/>
+        <w:numPr>
+          <w:ilvl w:val="0"/>
+          <w:numId w:val="1"/>
+        </w:numPr>
+        <w:spacing w:after="60"/>
+      </w:pPr>
+      <w:r>
+        <w:t xml:space="preserve">Cliente: cada tarefa é apresentada com uma checkbox (CheckboxListTile); ao alterá-la, o ApiClient.setCompleted(...) é chamado e a lista é recarregada, mostrando o item riscado quando completo.</w:t>
+      </w:r>
+    </w:p>
+    <w:p>
+      <w:pPr>
+        <w:spacing w:after="60" w:before="100"/>
+        <w:jc w:val="center"/>
+      </w:pPr>
+      <w:r>
+        <w:drawing>
+          <wp:inline distT="0" distB="0" distL="0" distR="0">
+            <wp:extent cx="5715000" cy="4543425"/>
+            <wp:effectExtent t="0" r="0" b="0" l="0"/>
+            <wp:docPr id="1" name="" descr="" title=""/>
+            <wp:cNvGraphicFramePr>
+              <a:graphicFrameLocks xmlns:a="http://schemas.openxmlformats.org/drawingml/2006/main" noChangeAspect="1"/>
+            </wp:cNvGraphicFramePr>
+            <a:graphic xmlns:a="http://schemas.openxmlformats.org/drawingml/2006/main">
+              <a:graphicData uri="http://schemas.openxmlformats.org/drawingml/2006/picture">
+                <pic:pic xmlns:pic="http://schemas.openxmlformats.org/drawingml/2006/picture">
+                  <pic:nvPicPr>
+                    <pic:cNvPr id="0" name="" descr=""/>
+                    <pic:cNvPicPr>
+                      <a:picLocks noChangeAspect="1" noChangeArrowheads="1"/>
+                    </pic:cNvPicPr>
+                  </pic:nvPicPr>
+                  <pic:blipFill>
+                    <a:blip r:embed="rId14" cstate="none"/>
+                    <a:srcRect/>
+                    <a:stretch>
+                      <a:fillRect/>
+                    </a:stretch>
+                  </pic:blipFill>
+                  <pic:spPr bwMode="auto">
+                    <a:xfrm>
+                      <a:off x="0" y="0"/>
                       <a:ext cx="5715000" cy="4543425"/>
                     </a:xfrm>
                     <a:prstGeom prst="rect">
@@ -3074,7 +3121,69 @@
           <w:sz w:val="18"/>
           <w:szCs w:val="18"/>
         </w:rPr>
-        <w:t xml:space="preserve">Figura — tarefa marcada como completa no cliente Flutter</w:t>
+        <w:t xml:space="preserve">Figura — tarefas marcadas como completas no Desktop (macOS)</w:t>
+      </w:r>
+    </w:p>
+    <w:p>
+      <w:pPr>
+        <w:spacing w:after="60" w:before="100"/>
+        <w:jc w:val="center"/>
+      </w:pPr>
+      <w:r>
+        <w:drawing>
+          <wp:inline distT="0" distB="0" distL="0" distR="0">
+            <wp:extent cx="5715000" cy="12411075"/>
+            <wp:effectExtent t="0" r="0" b="0" l="0"/>
+            <wp:docPr id="1" name="" descr="" title=""/>
+            <wp:cNvGraphicFramePr>
+              <a:graphicFrameLocks xmlns:a="http://schemas.openxmlformats.org/drawingml/2006/main" noChangeAspect="1"/>
+            </wp:cNvGraphicFramePr>
+            <a:graphic xmlns:a="http://schemas.openxmlformats.org/drawingml/2006/main">
+              <a:graphicData uri="http://schemas.openxmlformats.org/drawingml/2006/picture">
+                <pic:pic xmlns:pic="http://schemas.openxmlformats.org/drawingml/2006/picture">
+                  <pic:nvPicPr>
+                    <pic:cNvPr id="0" name="" descr=""/>
+                    <pic:cNvPicPr>
+                      <a:picLocks noChangeAspect="1" noChangeArrowheads="1"/>
+                    </pic:cNvPicPr>
+                  </pic:nvPicPr>
+                  <pic:blipFill>
+                    <a:blip r:embed="rId15" cstate="none"/>
+                    <a:srcRect/>
+                    <a:stretch>
+                      <a:fillRect/>
+                    </a:stretch>
+                  </pic:blipFill>
+                  <pic:spPr bwMode="auto">
+                    <a:xfrm>
+                      <a:off x="0" y="0"/>
+                      <a:ext cx="5715000" cy="12411075"/>
+                    </a:xfrm>
+                    <a:prstGeom prst="rect">
+                      <a:avLst/>
+                    </a:prstGeom>
+                  </pic:spPr>
+                </pic:pic>
+              </a:graphicData>
+            </a:graphic>
+          </wp:inline>
+        </w:drawing>
+      </w:r>
+    </w:p>
+    <w:p>
+      <w:pPr>
+        <w:spacing w:after="180"/>
+        <w:jc w:val="center"/>
+      </w:pPr>
+      <w:r>
+        <w:rPr>
+          <w:i/>
+          <w:iCs/>
+          <w:color w:val="666666"/>
+          <w:sz w:val="18"/>
+          <w:szCs w:val="18"/>
+        </w:rPr>
+        <w:t xml:space="preserve">Figura — tarefas marcadas como completas no iPhone, incluindo o item "Lab3" criado no próprio dispositivo</w:t>
       </w:r>
     </w:p>
     <w:p>
@@ -3130,7 +3239,7 @@
         <w:spacing w:after="60"/>
       </w:pPr>
       <w:r>
-        <w:t xml:space="preserve">Parte 3: cliente Flutter a correr em Desktop e Android, estendido com a funcionalidade de marcar tarefas como completas (API + cliente).</w:t>
+        <w:t xml:space="preserve">Parte 3: cliente Flutter a correr em Desktop (macOS) e num iPhone físico (iOS), estendido com a funcionalidade de marcar tarefas como completas (API + cliente), demonstrada em ambas as plataformas.</w:t>
       </w:r>
     </w:p>
     <w:p>

</xml_diff>

<commit_message>
Lab3: detalhes técnicos do deployment iOS (assinatura Xcode, provisioning, instalação no iPhone) no relatório
</commit_message>
<xml_diff>
--- a/Lab3/Relatorio_Lab3.docx
+++ b/Lab3/Relatorio_Lab3.docx
@@ -2853,7 +2853,15 @@
           <w:b/>
           <w:bCs/>
         </w:rPr>
-        <w:t xml:space="preserve">Notas de configuração encontradas e resolvidas:</w:t>
+        <w:t xml:space="preserve">Detalhes técnicos do deployment no iPhone (via Xcode):</w:t>
+      </w:r>
+    </w:p>
+    <w:p>
+      <w:pPr>
+        <w:spacing w:after="120" w:before="0"/>
+      </w:pPr>
+      <w:r>
+        <w:t xml:space="preserve">Ao contrário do Android (que empacota a aplicação num APK), no iOS a aplicação é compilada num bundle .app assinado (distribuível como .ipa) e só pode ser instalada num dispositivo físico depois de assinada com um certificado de programador. O processo seguido:</w:t>
       </w:r>
     </w:p>
     <w:p>
@@ -2866,7 +2874,7 @@
         <w:spacing w:after="60"/>
       </w:pPr>
       <w:r>
-        <w:t xml:space="preserve">macOS: a aplicação corre em sandbox e bloqueia ligações de saída por omissão. Foi adicionada a entitlement com.apple.security.network.client em macos/Runner/DebugProfile.entitlements e Release.entitlements.</w:t>
+        <w:t xml:space="preserve">flutter create --platforms=ios . — gera o projeto Xcode (ios/Runner.xcworkspace); as dependências nativas são geridas pelo CocoaPods;</w:t>
       </w:r>
     </w:p>
     <w:p>
@@ -2879,7 +2887,7 @@
         <w:spacing w:after="60"/>
       </w:pPr>
       <w:r>
-        <w:t xml:space="preserve">iOS: o iOS bloqueia HTTP em claro (App Transport Security); foi adicionado NSAllowsArbitraryLoads ao ios/Runner/Info.plist (apenas para testes locais).</w:t>
+        <w:t xml:space="preserve">No iPhone, ativou-se o Developer Mode (Definições → Privacidade e Segurança) e ligou-se o dispositivo por cabo ao Mac;</w:t>
       </w:r>
     </w:p>
     <w:p>
@@ -2892,7 +2900,84 @@
         <w:spacing w:after="60"/>
       </w:pPr>
       <w:r>
-        <w:t xml:space="preserve">Android: como a API de teste é HTTP (não HTTPS), é necessário android:usesCleartextTraffic="true" no AndroidManifest.xml (já aplicado).</w:t>
+        <w:t xml:space="preserve">No Xcode (target Runner → Signing &amp; Capabilities): ativou-se Automatically manage signing com a equipa pessoal associada ao Apple ID — o Xcode gera automaticamente o certificado de development e o provisioning profile que autorizam a instalação neste dispositivo (com conta gratuita, o perfil é válido por 7 dias);</w:t>
+      </w:r>
+    </w:p>
+    <w:p>
+      <w:pPr>
+        <w:pStyle w:val="ListParagraph"/>
+        <w:numPr>
+          <w:ilvl w:val="0"/>
+          <w:numId w:val="1"/>
+        </w:numPr>
+        <w:spacing w:after="60"/>
+      </w:pPr>
+      <w:r>
+        <w:t xml:space="preserve">flutter run -d &lt;iPhone&gt; — compila via xcodebuild, assina o .app, instala-o pelo cabo e lança a aplicação; na primeira execução foi necessário confiar no certificado no iPhone (Definições → Geral → VPN e Gestão de Dispositivos);</w:t>
+      </w:r>
+    </w:p>
+    <w:p>
+      <w:pPr>
+        <w:pStyle w:val="ListParagraph"/>
+        <w:numPr>
+          <w:ilvl w:val="0"/>
+          <w:numId w:val="1"/>
+        </w:numPr>
+        <w:spacing w:after="60"/>
+      </w:pPr>
+      <w:r>
+        <w:t xml:space="preserve">Como o dispositivo físico não vê o localhost do Mac, o campo "Servidor" do login foi apontado ao IP do anfitrião na rede local (http://192.168.1.64:7100), com o Mac e o iPhone na mesma rede Wi-Fi (a API Javalin escuta em 0.0.0.0, pelo que aceita ligações de qualquer interface sem reconfiguração).</w:t>
+      </w:r>
+    </w:p>
+    <w:p>
+      <w:pPr>
+        <w:spacing w:after="120" w:before="0"/>
+      </w:pPr>
+      <w:r>
+        <w:rPr>
+          <w:b/>
+          <w:bCs/>
+        </w:rPr>
+        <w:t xml:space="preserve">Notas de configuração encontradas e resolvidas:</w:t>
+      </w:r>
+    </w:p>
+    <w:p>
+      <w:pPr>
+        <w:pStyle w:val="ListParagraph"/>
+        <w:numPr>
+          <w:ilvl w:val="0"/>
+          <w:numId w:val="1"/>
+        </w:numPr>
+        <w:spacing w:after="60"/>
+      </w:pPr>
+      <w:r>
+        <w:t xml:space="preserve">macOS: a aplicação corre em sandbox e bloqueia ligações de saída por omissão. Foi adicionada a entitlement com.apple.security.network.client em macos/Runner/DebugProfile.entitlements e Release.entitlements.</w:t>
+      </w:r>
+    </w:p>
+    <w:p>
+      <w:pPr>
+        <w:pStyle w:val="ListParagraph"/>
+        <w:numPr>
+          <w:ilvl w:val="0"/>
+          <w:numId w:val="1"/>
+        </w:numPr>
+        <w:spacing w:after="60"/>
+      </w:pPr>
+      <w:r>
+        <w:t xml:space="preserve">iOS: o iOS bloqueia HTTP em claro (App Transport Security); foi adicionado NSAllowsArbitraryLoads ao ios/Runner/Info.plist (apenas para testes locais).</w:t>
+      </w:r>
+    </w:p>
+    <w:p>
+      <w:pPr>
+        <w:pStyle w:val="ListParagraph"/>
+        <w:numPr>
+          <w:ilvl w:val="0"/>
+          <w:numId w:val="1"/>
+        </w:numPr>
+        <w:spacing w:after="60"/>
+      </w:pPr>
+      <w:r>
+        <w:t xml:space="preserve">Android: como a API de teste é HTTP (não HTTPS), é necessário android:usesCleartextTraffic="true" no AndroidManifest.xml (já aplicado); a geração do APK correspondente faz-se com flutter build apk --release, exigindo o Android SDK.</w:t>
       </w:r>
     </w:p>
     <w:p>

</xml_diff>

<commit_message>
Lab3: alínea 3c — secção de Engenharia de Software da app própria; inclui todoapp-flutter (base fornecida) como referência
</commit_message>
<xml_diff>
--- a/Lab3/Relatorio_Lab3.docx
+++ b/Lab3/Relatorio_Lab3.docx
@@ -2591,6 +2591,23 @@
         <w:spacing w:after="120" w:before="240"/>
       </w:pPr>
       <w:r>
+        <w:t xml:space="preserve">5.0. Relação com o código exemplo fornecido (todoapp-flutter)</w:t>
+      </w:r>
+    </w:p>
+    <w:p>
+      <w:pPr>
+        <w:spacing w:after="120" w:before="0"/>
+      </w:pPr>
+      <w:r>
+        <w:t xml:space="preserve">O código exemplo fornecido (todoapp-flutter/, incluído no repositório para referência) foi analisado: consome os mesmos endpoints (/login, /todolist, /todo/{listId}/tasks) e o mesmo modelo de dados (id, listId, description, completed), mas é apenas de leitura (login e listagem) e traz somente os targets Android/iOS. A aplicação todoapp/ apresentada neste relatório foi desenhada e escrita de raiz (alínea c), mantendo total compatibilidade com o contrato da API do exemplo, e estende-o com: criação de listas e tarefas, eliminação, marcar tarefas como completas (alínea b), campo de servidor configurável no login e targets Desktop (macOS), iOS e Android.</w:t>
+      </w:r>
+    </w:p>
+    <w:p>
+      <w:pPr>
+        <w:pStyle w:val="Heading2"/>
+        <w:spacing w:after="120" w:before="240"/>
+      </w:pPr>
+      <w:r>
         <w:t xml:space="preserve">5.1. Arquitetura do cliente (Flutter)</w:t>
       </w:r>
     </w:p>
@@ -3273,11 +3290,11 @@
     </w:p>
     <w:p>
       <w:pPr>
-        <w:pStyle w:val="Heading1"/>
+        <w:pStyle w:val="Heading2"/>
         <w:spacing w:after="120" w:before="240"/>
       </w:pPr>
       <w:r>
-        <w:t xml:space="preserve">6. Conclusão</w:t>
+        <w:t xml:space="preserve">5.4. c) Aplicação Flutter própria — Engenharia de Software utilizada</w:t>
       </w:r>
     </w:p>
     <w:p>
@@ -3285,7 +3302,367 @@
         <w:spacing w:after="120" w:before="0"/>
       </w:pPr>
       <w:r>
-        <w:t xml:space="preserve">Todos os objetivos do laboratório foram cumpridos:</w:t>
+        <w:t xml:space="preserve">A aplicação todoapp/ foi desenhada e escrita de raiz para este laboratório, aplicando as práticas de engenharia de software trabalhadas nas sessões.</w:t>
+      </w:r>
+    </w:p>
+    <w:p>
+      <w:pPr>
+        <w:spacing w:after="120" w:before="0"/>
+      </w:pPr>
+      <w:r>
+        <w:rPr>
+          <w:b/>
+          <w:bCs/>
+        </w:rPr>
+        <w:t xml:space="preserve">Levantamento de requisitos.</w:t>
+      </w:r>
+    </w:p>
+    <w:p>
+      <w:pPr>
+        <w:spacing w:after="120" w:before="0"/>
+      </w:pPr>
+      <w:r>
+        <w:t xml:space="preserve">Os requisitos funcionais foram derivados do contrato da API (endpoints e DTOs dos labs 1/2) e do enunciado: autenticar, listar as listas do utilizador, navegar para os itens, criar, eliminar e marcar como completo. Requisitos não-funcionais: multiplataforma (Desktop/mobile a partir de uma única base de código), tolerância a falhas de rede (mensagens de erro claras) e configuração do servidor sem recompilar.</w:t>
+      </w:r>
+    </w:p>
+    <w:p>
+      <w:pPr>
+        <w:spacing w:after="120" w:before="0"/>
+      </w:pPr>
+      <w:r>
+        <w:rPr>
+          <w:b/>
+          <w:bCs/>
+        </w:rPr>
+        <w:t xml:space="preserve">Arquitetura em camadas (responsabilidade única por ficheiro):</w:t>
+      </w:r>
+    </w:p>
+    <w:tbl>
+      <w:tblPr>
+        <w:tblW w:type="dxa" w:w="9000"/>
+        <w:tblBorders>
+          <w:top w:val="single" w:color="auto" w:sz="4"/>
+          <w:left w:val="single" w:color="auto" w:sz="4"/>
+          <w:bottom w:val="single" w:color="auto" w:sz="4"/>
+          <w:right w:val="single" w:color="auto" w:sz="4"/>
+          <w:insideH w:val="single" w:color="auto" w:sz="4"/>
+          <w:insideV w:val="single" w:color="auto" w:sz="4"/>
+        </w:tblBorders>
+      </w:tblPr>
+      <w:tblGrid>
+        <w:gridCol w:w="1800"/>
+        <w:gridCol w:w="2400"/>
+        <w:gridCol w:w="4800"/>
+      </w:tblGrid>
+      <w:tr>
+        <w:trPr>
+          <w:tblHeader/>
+        </w:trPr>
+        <w:tc>
+          <w:tcPr>
+            <w:tcW w:type="dxa" w:w="1800"/>
+            <w:shd w:fill="2E4BB1" w:color="auto" w:val="clear"/>
+            <w:tcMar>
+              <w:top w:type="dxa" w:w="40"/>
+              <w:left w:type="dxa" w:w="80"/>
+              <w:bottom w:type="dxa" w:w="40"/>
+              <w:right w:type="dxa" w:w="80"/>
+            </w:tcMar>
+          </w:tcPr>
+          <w:p>
+            <w:r>
+              <w:rPr>
+                <w:b/>
+                <w:bCs/>
+                <w:color w:val="FFFFFF"/>
+                <w:sz w:val="20"/>
+                <w:szCs w:val="20"/>
+              </w:rPr>
+              <w:t xml:space="preserve">Camada</w:t>
+            </w:r>
+          </w:p>
+        </w:tc>
+        <w:tc>
+          <w:tcPr>
+            <w:tcW w:type="dxa" w:w="2400"/>
+            <w:shd w:fill="2E4BB1" w:color="auto" w:val="clear"/>
+            <w:tcMar>
+              <w:top w:type="dxa" w:w="40"/>
+              <w:left w:type="dxa" w:w="80"/>
+              <w:bottom w:type="dxa" w:w="40"/>
+              <w:right w:type="dxa" w:w="80"/>
+            </w:tcMar>
+          </w:tcPr>
+          <w:p>
+            <w:r>
+              <w:rPr>
+                <w:b/>
+                <w:bCs/>
+                <w:color w:val="FFFFFF"/>
+                <w:sz w:val="20"/>
+                <w:szCs w:val="20"/>
+              </w:rPr>
+              <w:t xml:space="preserve">Ficheiro</w:t>
+            </w:r>
+          </w:p>
+        </w:tc>
+        <w:tc>
+          <w:tcPr>
+            <w:tcW w:type="dxa" w:w="4800"/>
+            <w:shd w:fill="2E4BB1" w:color="auto" w:val="clear"/>
+            <w:tcMar>
+              <w:top w:type="dxa" w:w="40"/>
+              <w:left w:type="dxa" w:w="80"/>
+              <w:bottom w:type="dxa" w:w="40"/>
+              <w:right w:type="dxa" w:w="80"/>
+            </w:tcMar>
+          </w:tcPr>
+          <w:p>
+            <w:r>
+              <w:rPr>
+                <w:b/>
+                <w:bCs/>
+                <w:color w:val="FFFFFF"/>
+                <w:sz w:val="20"/>
+                <w:szCs w:val="20"/>
+              </w:rPr>
+              <w:t xml:space="preserve">Papel</w:t>
+            </w:r>
+          </w:p>
+        </w:tc>
+      </w:tr>
+      <w:tr>
+        <w:trPr>
+          <w:tblHeader w:val="false"/>
+        </w:trPr>
+        <w:tc>
+          <w:tcPr>
+            <w:tcW w:type="dxa" w:w="1800"/>
+            <w:tcMar>
+              <w:top w:type="dxa" w:w="40"/>
+              <w:left w:type="dxa" w:w="80"/>
+              <w:bottom w:type="dxa" w:w="40"/>
+              <w:right w:type="dxa" w:w="80"/>
+            </w:tcMar>
+          </w:tcPr>
+          <w:p>
+            <w:r>
+              <w:rPr>
+                <w:b w:val="false"/>
+                <w:bCs w:val="false"/>
+                <w:sz w:val="20"/>
+                <w:szCs w:val="20"/>
+              </w:rPr>
+              <w:t xml:space="preserve">Modelo</w:t>
+            </w:r>
+          </w:p>
+        </w:tc>
+        <w:tc>
+          <w:tcPr>
+            <w:tcW w:type="dxa" w:w="2400"/>
+            <w:tcMar>
+              <w:top w:type="dxa" w:w="40"/>
+              <w:left w:type="dxa" w:w="80"/>
+              <w:bottom w:type="dxa" w:w="40"/>
+              <w:right w:type="dxa" w:w="80"/>
+            </w:tcMar>
+          </w:tcPr>
+          <w:p>
+            <w:r>
+              <w:rPr>
+                <w:b w:val="false"/>
+                <w:bCs w:val="false"/>
+                <w:sz w:val="20"/>
+                <w:szCs w:val="20"/>
+              </w:rPr>
+              <w:t xml:space="preserve">models.dart</w:t>
+            </w:r>
+          </w:p>
+        </w:tc>
+        <w:tc>
+          <w:tcPr>
+            <w:tcW w:type="dxa" w:w="4800"/>
+            <w:tcMar>
+              <w:top w:type="dxa" w:w="40"/>
+              <w:left w:type="dxa" w:w="80"/>
+              <w:bottom w:type="dxa" w:w="40"/>
+              <w:right w:type="dxa" w:w="80"/>
+            </w:tcMar>
+          </w:tcPr>
+          <w:p>
+            <w:r>
+              <w:rPr>
+                <w:b w:val="false"/>
+                <w:bCs w:val="false"/>
+                <w:sz w:val="20"/>
+                <w:szCs w:val="20"/>
+              </w:rPr>
+              <w:t xml:space="preserve">DTOs imutáveis (TodoList, Todo) com fromJson — fronteira única de desserialização</w:t>
+            </w:r>
+          </w:p>
+        </w:tc>
+      </w:tr>
+      <w:tr>
+        <w:trPr>
+          <w:tblHeader w:val="false"/>
+        </w:trPr>
+        <w:tc>
+          <w:tcPr>
+            <w:tcW w:type="dxa" w:w="1800"/>
+            <w:tcMar>
+              <w:top w:type="dxa" w:w="40"/>
+              <w:left w:type="dxa" w:w="80"/>
+              <w:bottom w:type="dxa" w:w="40"/>
+              <w:right w:type="dxa" w:w="80"/>
+            </w:tcMar>
+          </w:tcPr>
+          <w:p>
+            <w:r>
+              <w:rPr>
+                <w:b w:val="false"/>
+                <w:bCs w:val="false"/>
+                <w:sz w:val="20"/>
+                <w:szCs w:val="20"/>
+              </w:rPr>
+              <w:t xml:space="preserve">Serviço</w:t>
+            </w:r>
+          </w:p>
+        </w:tc>
+        <w:tc>
+          <w:tcPr>
+            <w:tcW w:type="dxa" w:w="2400"/>
+            <w:tcMar>
+              <w:top w:type="dxa" w:w="40"/>
+              <w:left w:type="dxa" w:w="80"/>
+              <w:bottom w:type="dxa" w:w="40"/>
+              <w:right w:type="dxa" w:w="80"/>
+            </w:tcMar>
+          </w:tcPr>
+          <w:p>
+            <w:r>
+              <w:rPr>
+                <w:b w:val="false"/>
+                <w:bCs w:val="false"/>
+                <w:sz w:val="20"/>
+                <w:szCs w:val="20"/>
+              </w:rPr>
+              <w:t xml:space="preserve">api_client.dart</w:t>
+            </w:r>
+          </w:p>
+        </w:tc>
+        <w:tc>
+          <w:tcPr>
+            <w:tcW w:type="dxa" w:w="4800"/>
+            <w:tcMar>
+              <w:top w:type="dxa" w:w="40"/>
+              <w:left w:type="dxa" w:w="80"/>
+              <w:bottom w:type="dxa" w:w="40"/>
+              <w:right w:type="dxa" w:w="80"/>
+            </w:tcMar>
+          </w:tcPr>
+          <w:p>
+            <w:r>
+              <w:rPr>
+                <w:b w:val="false"/>
+                <w:bCs w:val="false"/>
+                <w:sz w:val="20"/>
+                <w:szCs w:val="20"/>
+              </w:rPr>
+              <w:t xml:space="preserve">Todo o HTTP num só sítio; guarda o token e injeta-o no header Authorization; converte respostas em modelos ou exceções</w:t>
+            </w:r>
+          </w:p>
+        </w:tc>
+      </w:tr>
+      <w:tr>
+        <w:trPr>
+          <w:tblHeader w:val="false"/>
+        </w:trPr>
+        <w:tc>
+          <w:tcPr>
+            <w:tcW w:type="dxa" w:w="1800"/>
+            <w:tcMar>
+              <w:top w:type="dxa" w:w="40"/>
+              <w:left w:type="dxa" w:w="80"/>
+              <w:bottom w:type="dxa" w:w="40"/>
+              <w:right w:type="dxa" w:w="80"/>
+            </w:tcMar>
+          </w:tcPr>
+          <w:p>
+            <w:r>
+              <w:rPr>
+                <w:b w:val="false"/>
+                <w:bCs w:val="false"/>
+                <w:sz w:val="20"/>
+                <w:szCs w:val="20"/>
+              </w:rPr>
+              <w:t xml:space="preserve">Apresentação</w:t>
+            </w:r>
+          </w:p>
+        </w:tc>
+        <w:tc>
+          <w:tcPr>
+            <w:tcW w:type="dxa" w:w="2400"/>
+            <w:tcMar>
+              <w:top w:type="dxa" w:w="40"/>
+              <w:left w:type="dxa" w:w="80"/>
+              <w:bottom w:type="dxa" w:w="40"/>
+              <w:right w:type="dxa" w:w="80"/>
+            </w:tcMar>
+          </w:tcPr>
+          <w:p>
+            <w:r>
+              <w:rPr>
+                <w:b w:val="false"/>
+                <w:bCs w:val="false"/>
+                <w:sz w:val="20"/>
+                <w:szCs w:val="20"/>
+              </w:rPr>
+              <w:t xml:space="preserve">main.dart</w:t>
+            </w:r>
+          </w:p>
+        </w:tc>
+        <w:tc>
+          <w:tcPr>
+            <w:tcW w:type="dxa" w:w="4800"/>
+            <w:tcMar>
+              <w:top w:type="dxa" w:w="40"/>
+              <w:left w:type="dxa" w:w="80"/>
+              <w:bottom w:type="dxa" w:w="40"/>
+              <w:right w:type="dxa" w:w="80"/>
+            </w:tcMar>
+          </w:tcPr>
+          <w:p>
+            <w:r>
+              <w:rPr>
+                <w:b w:val="false"/>
+                <w:bCs w:val="false"/>
+                <w:sz w:val="20"/>
+                <w:szCs w:val="20"/>
+              </w:rPr>
+              <w:t xml:space="preserve">Três ecrãs (Login → Listas → Tarefas); nenhuma chamada HTTP direta na UI</w:t>
+            </w:r>
+          </w:p>
+        </w:tc>
+      </w:tr>
+    </w:tbl>
+    <w:p>
+      <w:pPr>
+        <w:spacing w:after="120" w:before="0"/>
+      </w:pPr>
+      <w:r>
+        <w:t xml:space="preserve">Esta separação (padrão service/repository no cliente) permite trocar a API ou testar as camadas isoladamente — a mesma disciplina usada no back-end (controller → service → repository).</w:t>
+      </w:r>
+    </w:p>
+    <w:p>
+      <w:pPr>
+        <w:spacing w:after="120" w:before="0"/>
+      </w:pPr>
+      <w:r>
+        <w:rPr>
+          <w:b/>
+          <w:bCs/>
+        </w:rPr>
+        <w:t xml:space="preserve">Padrões e técnicas aplicados:</w:t>
       </w:r>
     </w:p>
     <w:p>
@@ -3298,7 +3675,7 @@
         <w:spacing w:after="60"/>
       </w:pPr>
       <w:r>
-        <w:t xml:space="preserve">Parte 1: 19 testes unitários JUnit5 para InMemoryUserRepository e TodoUserService, com 100 % de cobertura de linhas em ambas as classes.</w:t>
+        <w:t xml:space="preserve">Estado assíncrono declarativo: FutureBuilder para os três estados (a carregar / erro / dados), evitando gestão manual de estado;</w:t>
       </w:r>
     </w:p>
     <w:p>
@@ -3311,7 +3688,7 @@
         <w:spacing w:after="60"/>
       </w:pPr>
       <w:r>
-        <w:t xml:space="preserve">Parte 2: coleção Postman executada com Newman, com 19 asserções sem falhas tanto no repositório em memória como em PostgreSQL.</w:t>
+        <w:t xml:space="preserve">Injeção de dependência simples: o ApiClient autenticado é passado aos ecrãs por construtor — não há singletons globais;</w:t>
       </w:r>
     </w:p>
     <w:p>
@@ -3324,7 +3701,129 @@
         <w:spacing w:after="60"/>
       </w:pPr>
       <w:r>
+        <w:t xml:space="preserve">Configuração por plataforma: o endereço por omissão adapta-se em runtime (localhost no Desktop, 10.0.2.2 no emulador Android) e é editável no ecrã de login para dispositivos físicos — sem rebuild;</w:t>
+      </w:r>
+    </w:p>
+    <w:p>
+      <w:pPr>
+        <w:pStyle w:val="ListParagraph"/>
+        <w:numPr>
+          <w:ilvl w:val="0"/>
+          <w:numId w:val="1"/>
+        </w:numPr>
+        <w:spacing w:after="60"/>
+      </w:pPr>
+      <w:r>
+        <w:t xml:space="preserve">Tratamento de erros: códigos HTTP inesperados geram exceções com contexto, apresentadas ao utilizador; o login distingue credenciais inválidas de falhas de rede.</w:t>
+      </w:r>
+    </w:p>
+    <w:p>
+      <w:pPr>
+        <w:spacing w:after="120" w:before="0"/>
+      </w:pPr>
+      <w:r>
+        <w:rPr>
+          <w:b/>
+          <w:bCs/>
+        </w:rPr>
+        <w:t xml:space="preserve">Considerações de segurança.</w:t>
+      </w:r>
+    </w:p>
+    <w:p>
+      <w:pPr>
+        <w:spacing w:after="120" w:before="0"/>
+      </w:pPr>
+      <w:r>
+        <w:t xml:space="preserve">O token vive apenas em memória (não é persistido em disco), reduzindo a exposição em caso de perda do dispositivo; as exceções ao bloqueio de HTTP em claro (ATS no iOS, usesCleartextTraffic no Android, entitlement no macOS) estão documentadas como medidas exclusivas de ambiente de teste — em produção usar-se-ia HTTPS.</w:t>
+      </w:r>
+    </w:p>
+    <w:p>
+      <w:pPr>
+        <w:spacing w:after="120" w:before="0"/>
+      </w:pPr>
+      <w:r>
+        <w:rPr>
+          <w:b/>
+          <w:bCs/>
+        </w:rPr>
+        <w:t xml:space="preserve">Processo.</w:t>
+      </w:r>
+    </w:p>
+    <w:p>
+      <w:pPr>
+        <w:spacing w:after="120" w:before="0"/>
+      </w:pPr>
+      <w:r>
+        <w:t xml:space="preserve">Desenvolvimento iterativo e incremental com controlo de versões (git, commits pequenos e descritivos): primeiro o fluxo mínimo (login + listagem), depois as operações de escrita, por fim a funcionalidade de marcar-completo em toda a stack; cada iteração foi validada manualmente contra a API real em três plataformas (macOS, iPhone físico e, no desenvolvimento, Chrome), tendo os defeitos encontrados (sandbox do macOS, ATS do iOS, setState com Future) sido corrigidos e documentados neste relatório.</w:t>
+      </w:r>
+    </w:p>
+    <w:p>
+      <w:pPr>
+        <w:pStyle w:val="Heading1"/>
+        <w:spacing w:after="120" w:before="240"/>
+      </w:pPr>
+      <w:r>
+        <w:t xml:space="preserve">6. Conclusão</w:t>
+      </w:r>
+    </w:p>
+    <w:p>
+      <w:pPr>
+        <w:spacing w:after="120" w:before="0"/>
+      </w:pPr>
+      <w:r>
+        <w:t xml:space="preserve">Todos os objetivos do laboratório foram cumpridos:</w:t>
+      </w:r>
+    </w:p>
+    <w:p>
+      <w:pPr>
+        <w:pStyle w:val="ListParagraph"/>
+        <w:numPr>
+          <w:ilvl w:val="0"/>
+          <w:numId w:val="1"/>
+        </w:numPr>
+        <w:spacing w:after="60"/>
+      </w:pPr>
+      <w:r>
+        <w:t xml:space="preserve">Parte 1: 19 testes unitários JUnit5 para InMemoryUserRepository e TodoUserService, com 100 % de cobertura de linhas em ambas as classes.</w:t>
+      </w:r>
+    </w:p>
+    <w:p>
+      <w:pPr>
+        <w:pStyle w:val="ListParagraph"/>
+        <w:numPr>
+          <w:ilvl w:val="0"/>
+          <w:numId w:val="1"/>
+        </w:numPr>
+        <w:spacing w:after="60"/>
+      </w:pPr>
+      <w:r>
+        <w:t xml:space="preserve">Parte 2: coleção Postman executada com Newman, com 19 asserções sem falhas tanto no repositório em memória como em PostgreSQL.</w:t>
+      </w:r>
+    </w:p>
+    <w:p>
+      <w:pPr>
+        <w:pStyle w:val="ListParagraph"/>
+        <w:numPr>
+          <w:ilvl w:val="0"/>
+          <w:numId w:val="1"/>
+        </w:numPr>
+        <w:spacing w:after="60"/>
+      </w:pPr>
+      <w:r>
         <w:t xml:space="preserve">Parte 3: cliente Flutter a correr em Desktop (macOS) e num iPhone físico (iOS), estendido com a funcionalidade de marcar tarefas como completas (API + cliente), demonstrada em ambas as plataformas.</w:t>
+      </w:r>
+    </w:p>
+    <w:p>
+      <w:pPr>
+        <w:pStyle w:val="ListParagraph"/>
+        <w:numPr>
+          <w:ilvl w:val="0"/>
+          <w:numId w:val="1"/>
+        </w:numPr>
+        <w:spacing w:after="60"/>
+      </w:pPr>
+      <w:r>
+        <w:t xml:space="preserve">Parte 3c: aplicação Flutter desenhada e escrita de raiz (compatível e mais completa que o exemplo fornecido), acompanhada do relatório da engenharia de software utilizada no seu desenvolvimento (secção 5.4).</w:t>
       </w:r>
     </w:p>
     <w:p>

</xml_diff>

<commit_message>
Lab3: parte 3a completa — app testada em emulador Android (Pixel 9, API 36) além de Desktop e iPhone
</commit_message>
<xml_diff>
--- a/Lab3/Relatorio_Lab3.docx
+++ b/Lab3/Relatorio_Lab3.docx
@@ -2858,7 +2858,331 @@
         <w:spacing w:after="120" w:before="0"/>
       </w:pPr>
       <w:r>
-        <w:t xml:space="preserve">A aplicação foi testada em Desktop (macOS) e num iPhone físico (iOS), ligado por cabo e assinado via Xcode (Automatically manage signing). No iPhone, o campo "Servidor" foi apontado ao IP do Mac na rede local (http://192.168.1.64:7100), com ambos os equipamentos na mesma rede Wi-Fi. O runner Android está igualmente incluído e configurado no projeto (o emulador Android não foi executado por limitação de tempo na preparação do ambiente; o dispositivo iOS físico demonstra o mesmo objetivo multiplataforma em mobile).</w:t>
+        <w:t xml:space="preserve">A aplicação foi testada nas três plataformas a partir da mesma base de código:</w:t>
+      </w:r>
+    </w:p>
+    <w:tbl>
+      <w:tblPr>
+        <w:tblW w:type="dxa" w:w="9000"/>
+        <w:tblBorders>
+          <w:top w:val="single" w:color="auto" w:sz="4"/>
+          <w:left w:val="single" w:color="auto" w:sz="4"/>
+          <w:bottom w:val="single" w:color="auto" w:sz="4"/>
+          <w:right w:val="single" w:color="auto" w:sz="4"/>
+          <w:insideH w:val="single" w:color="auto" w:sz="4"/>
+          <w:insideV w:val="single" w:color="auto" w:sz="4"/>
+        </w:tblBorders>
+      </w:tblPr>
+      <w:tblGrid>
+        <w:gridCol w:w="1800"/>
+        <w:gridCol w:w="3800"/>
+        <w:gridCol w:w="3400"/>
+      </w:tblGrid>
+      <w:tr>
+        <w:trPr>
+          <w:tblHeader/>
+        </w:trPr>
+        <w:tc>
+          <w:tcPr>
+            <w:tcW w:type="dxa" w:w="1800"/>
+            <w:shd w:fill="2E4BB1" w:color="auto" w:val="clear"/>
+            <w:tcMar>
+              <w:top w:type="dxa" w:w="40"/>
+              <w:left w:type="dxa" w:w="80"/>
+              <w:bottom w:type="dxa" w:w="40"/>
+              <w:right w:type="dxa" w:w="80"/>
+            </w:tcMar>
+          </w:tcPr>
+          <w:p>
+            <w:r>
+              <w:rPr>
+                <w:b/>
+                <w:bCs/>
+                <w:color w:val="FFFFFF"/>
+                <w:sz w:val="20"/>
+                <w:szCs w:val="20"/>
+              </w:rPr>
+              <w:t xml:space="preserve">Plataforma</w:t>
+            </w:r>
+          </w:p>
+        </w:tc>
+        <w:tc>
+          <w:tcPr>
+            <w:tcW w:type="dxa" w:w="3800"/>
+            <w:shd w:fill="2E4BB1" w:color="auto" w:val="clear"/>
+            <w:tcMar>
+              <w:top w:type="dxa" w:w="40"/>
+              <w:left w:type="dxa" w:w="80"/>
+              <w:bottom w:type="dxa" w:w="40"/>
+              <w:right w:type="dxa" w:w="80"/>
+            </w:tcMar>
+          </w:tcPr>
+          <w:p>
+            <w:r>
+              <w:rPr>
+                <w:b/>
+                <w:bCs/>
+                <w:color w:val="FFFFFF"/>
+                <w:sz w:val="20"/>
+                <w:szCs w:val="20"/>
+              </w:rPr>
+              <w:t xml:space="preserve">Ambiente</w:t>
+            </w:r>
+          </w:p>
+        </w:tc>
+        <w:tc>
+          <w:tcPr>
+            <w:tcW w:type="dxa" w:w="3400"/>
+            <w:shd w:fill="2E4BB1" w:color="auto" w:val="clear"/>
+            <w:tcMar>
+              <w:top w:type="dxa" w:w="40"/>
+              <w:left w:type="dxa" w:w="80"/>
+              <w:bottom w:type="dxa" w:w="40"/>
+              <w:right w:type="dxa" w:w="80"/>
+            </w:tcMar>
+          </w:tcPr>
+          <w:p>
+            <w:r>
+              <w:rPr>
+                <w:b/>
+                <w:bCs/>
+                <w:color w:val="FFFFFF"/>
+                <w:sz w:val="20"/>
+                <w:szCs w:val="20"/>
+              </w:rPr>
+              <w:t xml:space="preserve">Endereço da API</w:t>
+            </w:r>
+          </w:p>
+        </w:tc>
+      </w:tr>
+      <w:tr>
+        <w:trPr>
+          <w:tblHeader w:val="false"/>
+        </w:trPr>
+        <w:tc>
+          <w:tcPr>
+            <w:tcW w:type="dxa" w:w="1800"/>
+            <w:tcMar>
+              <w:top w:type="dxa" w:w="40"/>
+              <w:left w:type="dxa" w:w="80"/>
+              <w:bottom w:type="dxa" w:w="40"/>
+              <w:right w:type="dxa" w:w="80"/>
+            </w:tcMar>
+          </w:tcPr>
+          <w:p>
+            <w:r>
+              <w:rPr>
+                <w:b w:val="false"/>
+                <w:bCs w:val="false"/>
+                <w:sz w:val="20"/>
+                <w:szCs w:val="20"/>
+              </w:rPr>
+              <w:t xml:space="preserve">Desktop</w:t>
+            </w:r>
+          </w:p>
+        </w:tc>
+        <w:tc>
+          <w:tcPr>
+            <w:tcW w:type="dxa" w:w="3800"/>
+            <w:tcMar>
+              <w:top w:type="dxa" w:w="40"/>
+              <w:left w:type="dxa" w:w="80"/>
+              <w:bottom w:type="dxa" w:w="40"/>
+              <w:right w:type="dxa" w:w="80"/>
+            </w:tcMar>
+          </w:tcPr>
+          <w:p>
+            <w:r>
+              <w:rPr>
+                <w:b w:val="false"/>
+                <w:bCs w:val="false"/>
+                <w:sz w:val="20"/>
+                <w:szCs w:val="20"/>
+              </w:rPr>
+              <w:t xml:space="preserve">macOS (target macos)</w:t>
+            </w:r>
+          </w:p>
+        </w:tc>
+        <w:tc>
+          <w:tcPr>
+            <w:tcW w:type="dxa" w:w="3400"/>
+            <w:tcMar>
+              <w:top w:type="dxa" w:w="40"/>
+              <w:left w:type="dxa" w:w="80"/>
+              <w:bottom w:type="dxa" w:w="40"/>
+              <w:right w:type="dxa" w:w="80"/>
+            </w:tcMar>
+          </w:tcPr>
+          <w:p>
+            <w:r>
+              <w:rPr>
+                <w:b w:val="false"/>
+                <w:bCs w:val="false"/>
+                <w:sz w:val="20"/>
+                <w:szCs w:val="20"/>
+              </w:rPr>
+              <w:t xml:space="preserve">http://localhost:7100 (automático)</w:t>
+            </w:r>
+          </w:p>
+        </w:tc>
+      </w:tr>
+      <w:tr>
+        <w:trPr>
+          <w:tblHeader w:val="false"/>
+        </w:trPr>
+        <w:tc>
+          <w:tcPr>
+            <w:tcW w:type="dxa" w:w="1800"/>
+            <w:tcMar>
+              <w:top w:type="dxa" w:w="40"/>
+              <w:left w:type="dxa" w:w="80"/>
+              <w:bottom w:type="dxa" w:w="40"/>
+              <w:right w:type="dxa" w:w="80"/>
+            </w:tcMar>
+          </w:tcPr>
+          <w:p>
+            <w:r>
+              <w:rPr>
+                <w:b w:val="false"/>
+                <w:bCs w:val="false"/>
+                <w:sz w:val="20"/>
+                <w:szCs w:val="20"/>
+              </w:rPr>
+              <w:t xml:space="preserve">Android</w:t>
+            </w:r>
+          </w:p>
+        </w:tc>
+        <w:tc>
+          <w:tcPr>
+            <w:tcW w:type="dxa" w:w="3800"/>
+            <w:tcMar>
+              <w:top w:type="dxa" w:w="40"/>
+              <w:left w:type="dxa" w:w="80"/>
+              <w:bottom w:type="dxa" w:w="40"/>
+              <w:right w:type="dxa" w:w="80"/>
+            </w:tcMar>
+          </w:tcPr>
+          <w:p>
+            <w:r>
+              <w:rPr>
+                <w:b w:val="false"/>
+                <w:bCs w:val="false"/>
+                <w:sz w:val="20"/>
+                <w:szCs w:val="20"/>
+              </w:rPr>
+              <w:t xml:space="preserve">Emulador Pixel 9, Android 16 (API 36), arm64</w:t>
+            </w:r>
+          </w:p>
+        </w:tc>
+        <w:tc>
+          <w:tcPr>
+            <w:tcW w:type="dxa" w:w="3400"/>
+            <w:tcMar>
+              <w:top w:type="dxa" w:w="40"/>
+              <w:left w:type="dxa" w:w="80"/>
+              <w:bottom w:type="dxa" w:w="40"/>
+              <w:right w:type="dxa" w:w="80"/>
+            </w:tcMar>
+          </w:tcPr>
+          <w:p>
+            <w:r>
+              <w:rPr>
+                <w:b w:val="false"/>
+                <w:bCs w:val="false"/>
+                <w:sz w:val="20"/>
+                <w:szCs w:val="20"/>
+              </w:rPr>
+              <w:t xml:space="preserve">http://10.0.2.2:7100 (automático)</w:t>
+            </w:r>
+          </w:p>
+        </w:tc>
+      </w:tr>
+      <w:tr>
+        <w:trPr>
+          <w:tblHeader w:val="false"/>
+        </w:trPr>
+        <w:tc>
+          <w:tcPr>
+            <w:tcW w:type="dxa" w:w="1800"/>
+            <w:tcMar>
+              <w:top w:type="dxa" w:w="40"/>
+              <w:left w:type="dxa" w:w="80"/>
+              <w:bottom w:type="dxa" w:w="40"/>
+              <w:right w:type="dxa" w:w="80"/>
+            </w:tcMar>
+          </w:tcPr>
+          <w:p>
+            <w:r>
+              <w:rPr>
+                <w:b w:val="false"/>
+                <w:bCs w:val="false"/>
+                <w:sz w:val="20"/>
+                <w:szCs w:val="20"/>
+              </w:rPr>
+              <w:t xml:space="preserve">iOS (extra)</w:t>
+            </w:r>
+          </w:p>
+        </w:tc>
+        <w:tc>
+          <w:tcPr>
+            <w:tcW w:type="dxa" w:w="3800"/>
+            <w:tcMar>
+              <w:top w:type="dxa" w:w="40"/>
+              <w:left w:type="dxa" w:w="80"/>
+              <w:bottom w:type="dxa" w:w="40"/>
+              <w:right w:type="dxa" w:w="80"/>
+            </w:tcMar>
+          </w:tcPr>
+          <w:p>
+            <w:r>
+              <w:rPr>
+                <w:b w:val="false"/>
+                <w:bCs w:val="false"/>
+                <w:sz w:val="20"/>
+                <w:szCs w:val="20"/>
+              </w:rPr>
+              <w:t xml:space="preserve">iPhone físico, assinado via Xcode</w:t>
+            </w:r>
+          </w:p>
+        </w:tc>
+        <w:tc>
+          <w:tcPr>
+            <w:tcW w:type="dxa" w:w="3400"/>
+            <w:tcMar>
+              <w:top w:type="dxa" w:w="40"/>
+              <w:left w:type="dxa" w:w="80"/>
+              <w:bottom w:type="dxa" w:w="40"/>
+              <w:right w:type="dxa" w:w="80"/>
+            </w:tcMar>
+          </w:tcPr>
+          <w:p>
+            <w:r>
+              <w:rPr>
+                <w:b w:val="false"/>
+                <w:bCs w:val="false"/>
+                <w:sz w:val="20"/>
+                <w:szCs w:val="20"/>
+              </w:rPr>
+              <w:t xml:space="preserve">http://192.168.1.64:7100 (IP do Mac na rede local)</w:t>
+            </w:r>
+          </w:p>
+        </w:tc>
+      </w:tr>
+    </w:tbl>
+    <w:p>
+      <w:pPr>
+        <w:spacing w:after="120" w:before="0"/>
+      </w:pPr>
+      <w:r>
+        <w:t xml:space="preserve">No Android, o emulador foi criado no Android Studio (Device Manager) e a aplicação instalada com flutter run -d emulator-5554; o endereço 10.0.2.2 é resolvido automaticamente pela aplicação, por ser o alias do anfitrião visto de dentro do emulador.</w:t>
+      </w:r>
+    </w:p>
+    <w:p>
+      <w:pPr>
+        <w:spacing w:after="120" w:before="0"/>
+      </w:pPr>
+      <w:r>
+        <w:t xml:space="preserve">Como demonstração adicional de portabilidade, a mesma base de código foi ainda executada num iPhone físico, ligado por cabo e assinado via Xcode (Automatically manage signing), com o campo "Servidor" apontado ao IP do Mac na rede local (ambos na mesma rede Wi-Fi).</w:t>
       </w:r>
     </w:p>
     <w:p>
@@ -3067,7 +3391,7 @@
       <w:r>
         <w:drawing>
           <wp:inline distT="0" distB="0" distL="0" distR="0">
-            <wp:extent cx="5715000" cy="12411075"/>
+            <wp:extent cx="5715000" cy="9734550"/>
             <wp:effectExtent t="0" r="0" b="0" l="0"/>
             <wp:docPr id="1" name="" descr="" title=""/>
             <wp:cNvGraphicFramePr>
@@ -3092,7 +3416,7 @@
                   <pic:spPr bwMode="auto">
                     <a:xfrm>
                       <a:off x="0" y="0"/>
-                      <a:ext cx="5715000" cy="12411075"/>
+                      <a:ext cx="5715000" cy="9734550"/>
                     </a:xfrm>
                     <a:prstGeom prst="rect">
                       <a:avLst/>
@@ -3118,50 +3442,7 @@
           <w:sz w:val="18"/>
           <w:szCs w:val="18"/>
         </w:rPr>
-        <w:t xml:space="preserve">Figura — login no iPhone físico, com o servidor apontado ao IP do Mac na rede local</w:t>
-      </w:r>
-    </w:p>
-    <w:p>
-      <w:pPr>
-        <w:pStyle w:val="Heading2"/>
-        <w:spacing w:after="120" w:before="240"/>
-      </w:pPr>
-      <w:r>
-        <w:t xml:space="preserve">5.3. b) Marcar tarefas como completas (API + cliente)</w:t>
-      </w:r>
-    </w:p>
-    <w:p>
-      <w:pPr>
-        <w:spacing w:after="120" w:before="0"/>
-      </w:pPr>
-      <w:r>
-        <w:t xml:space="preserve">A funcionalidade foi implementada em toda a stack:</w:t>
-      </w:r>
-    </w:p>
-    <w:p>
-      <w:pPr>
-        <w:pStyle w:val="ListParagraph"/>
-        <w:numPr>
-          <w:ilvl w:val="0"/>
-          <w:numId w:val="1"/>
-        </w:numPr>
-        <w:spacing w:after="60"/>
-      </w:pPr>
-      <w:r>
-        <w:t xml:space="preserve">API: novos endpoints PUT /todo/{listId}/tasks/{taskId}/complete e /incomplete. O TodoController verifica a posse da lista, e o TodoService.setCompleted(...) altera o campo completed e persiste via TodoRepository.update(...) (memória e SQL).</w:t>
-      </w:r>
-    </w:p>
-    <w:p>
-      <w:pPr>
-        <w:pStyle w:val="ListParagraph"/>
-        <w:numPr>
-          <w:ilvl w:val="0"/>
-          <w:numId w:val="1"/>
-        </w:numPr>
-        <w:spacing w:after="60"/>
-      </w:pPr>
-      <w:r>
-        <w:t xml:space="preserve">Cliente: cada tarefa é apresentada com uma checkbox (CheckboxListTile); ao alterá-la, o ApiClient.setCompleted(...) é chamado e a lista é recarregada, mostrando o item riscado quando completo.</w:t>
+        <w:t xml:space="preserve">Figura — login no emulador Android (Pixel 9, API 36), com o endereço 10.0.2.2 resolvido automaticamente</w:t>
       </w:r>
     </w:p>
     <w:p>
@@ -3172,7 +3453,7 @@
       <w:r>
         <w:drawing>
           <wp:inline distT="0" distB="0" distL="0" distR="0">
-            <wp:extent cx="5715000" cy="4543425"/>
+            <wp:extent cx="5715000" cy="11706225"/>
             <wp:effectExtent t="0" r="0" b="0" l="0"/>
             <wp:docPr id="1" name="" descr="" title=""/>
             <wp:cNvGraphicFramePr>
@@ -3197,7 +3478,7 @@
                   <pic:spPr bwMode="auto">
                     <a:xfrm>
                       <a:off x="0" y="0"/>
-                      <a:ext cx="5715000" cy="4543425"/>
+                      <a:ext cx="5715000" cy="11706225"/>
                     </a:xfrm>
                     <a:prstGeom prst="rect">
                       <a:avLst/>
@@ -3223,7 +3504,7 @@
           <w:sz w:val="18"/>
           <w:szCs w:val="18"/>
         </w:rPr>
-        <w:t xml:space="preserve">Figura — tarefas marcadas como completas no Desktop (macOS)</w:t>
+        <w:t xml:space="preserve">Figura — listas do utilizador no emulador Android</w:t>
       </w:r>
     </w:p>
     <w:p>
@@ -3285,7 +3566,244 @@
           <w:sz w:val="18"/>
           <w:szCs w:val="18"/>
         </w:rPr>
-        <w:t xml:space="preserve">Figura — tarefas marcadas como completas no iPhone, incluindo o item "Lab3" criado no próprio dispositivo</w:t>
+        <w:t xml:space="preserve">Figura — login no iPhone físico, com o servidor apontado ao IP do Mac na rede local</w:t>
+      </w:r>
+    </w:p>
+    <w:p>
+      <w:pPr>
+        <w:pStyle w:val="Heading2"/>
+        <w:spacing w:after="120" w:before="240"/>
+      </w:pPr>
+      <w:r>
+        <w:t xml:space="preserve">5.3. b) Marcar tarefas como completas (API + cliente)</w:t>
+      </w:r>
+    </w:p>
+    <w:p>
+      <w:pPr>
+        <w:spacing w:after="120" w:before="0"/>
+      </w:pPr>
+      <w:r>
+        <w:t xml:space="preserve">A funcionalidade foi implementada em toda a stack:</w:t>
+      </w:r>
+    </w:p>
+    <w:p>
+      <w:pPr>
+        <w:pStyle w:val="ListParagraph"/>
+        <w:numPr>
+          <w:ilvl w:val="0"/>
+          <w:numId w:val="1"/>
+        </w:numPr>
+        <w:spacing w:after="60"/>
+      </w:pPr>
+      <w:r>
+        <w:t xml:space="preserve">API: novos endpoints PUT /todo/{listId}/tasks/{taskId}/complete e /incomplete. O TodoController verifica a posse da lista, e o TodoService.setCompleted(...) altera o campo completed e persiste via TodoRepository.update(...) (memória e SQL).</w:t>
+      </w:r>
+    </w:p>
+    <w:p>
+      <w:pPr>
+        <w:pStyle w:val="ListParagraph"/>
+        <w:numPr>
+          <w:ilvl w:val="0"/>
+          <w:numId w:val="1"/>
+        </w:numPr>
+        <w:spacing w:after="60"/>
+      </w:pPr>
+      <w:r>
+        <w:t xml:space="preserve">Cliente: cada tarefa é apresentada com uma checkbox (CheckboxListTile); ao alterá-la, o ApiClient.setCompleted(...) é chamado e a lista é recarregada, mostrando o item riscado quando completo.</w:t>
+      </w:r>
+    </w:p>
+    <w:p>
+      <w:pPr>
+        <w:spacing w:after="60" w:before="100"/>
+        <w:jc w:val="center"/>
+      </w:pPr>
+      <w:r>
+        <w:drawing>
+          <wp:inline distT="0" distB="0" distL="0" distR="0">
+            <wp:extent cx="5715000" cy="4543425"/>
+            <wp:effectExtent t="0" r="0" b="0" l="0"/>
+            <wp:docPr id="1" name="" descr="" title=""/>
+            <wp:cNvGraphicFramePr>
+              <a:graphicFrameLocks xmlns:a="http://schemas.openxmlformats.org/drawingml/2006/main" noChangeAspect="1"/>
+            </wp:cNvGraphicFramePr>
+            <a:graphic xmlns:a="http://schemas.openxmlformats.org/drawingml/2006/main">
+              <a:graphicData uri="http://schemas.openxmlformats.org/drawingml/2006/picture">
+                <pic:pic xmlns:pic="http://schemas.openxmlformats.org/drawingml/2006/picture">
+                  <pic:nvPicPr>
+                    <pic:cNvPr id="0" name="" descr=""/>
+                    <pic:cNvPicPr>
+                      <a:picLocks noChangeAspect="1" noChangeArrowheads="1"/>
+                    </pic:cNvPicPr>
+                  </pic:nvPicPr>
+                  <pic:blipFill>
+                    <a:blip r:embed="rId16" cstate="none"/>
+                    <a:srcRect/>
+                    <a:stretch>
+                      <a:fillRect/>
+                    </a:stretch>
+                  </pic:blipFill>
+                  <pic:spPr bwMode="auto">
+                    <a:xfrm>
+                      <a:off x="0" y="0"/>
+                      <a:ext cx="5715000" cy="4543425"/>
+                    </a:xfrm>
+                    <a:prstGeom prst="rect">
+                      <a:avLst/>
+                    </a:prstGeom>
+                  </pic:spPr>
+                </pic:pic>
+              </a:graphicData>
+            </a:graphic>
+          </wp:inline>
+        </w:drawing>
+      </w:r>
+    </w:p>
+    <w:p>
+      <w:pPr>
+        <w:spacing w:after="180"/>
+        <w:jc w:val="center"/>
+      </w:pPr>
+      <w:r>
+        <w:rPr>
+          <w:i/>
+          <w:iCs/>
+          <w:color w:val="666666"/>
+          <w:sz w:val="18"/>
+          <w:szCs w:val="18"/>
+        </w:rPr>
+        <w:t xml:space="preserve">Figura — tarefas marcadas como completas no Desktop (macOS)</w:t>
+      </w:r>
+    </w:p>
+    <w:p>
+      <w:pPr>
+        <w:spacing w:after="60" w:before="100"/>
+        <w:jc w:val="center"/>
+      </w:pPr>
+      <w:r>
+        <w:drawing>
+          <wp:inline distT="0" distB="0" distL="0" distR="0">
+            <wp:extent cx="5715000" cy="11791950"/>
+            <wp:effectExtent t="0" r="0" b="0" l="0"/>
+            <wp:docPr id="1" name="" descr="" title=""/>
+            <wp:cNvGraphicFramePr>
+              <a:graphicFrameLocks xmlns:a="http://schemas.openxmlformats.org/drawingml/2006/main" noChangeAspect="1"/>
+            </wp:cNvGraphicFramePr>
+            <a:graphic xmlns:a="http://schemas.openxmlformats.org/drawingml/2006/main">
+              <a:graphicData uri="http://schemas.openxmlformats.org/drawingml/2006/picture">
+                <pic:pic xmlns:pic="http://schemas.openxmlformats.org/drawingml/2006/picture">
+                  <pic:nvPicPr>
+                    <pic:cNvPr id="0" name="" descr=""/>
+                    <pic:cNvPicPr>
+                      <a:picLocks noChangeAspect="1" noChangeArrowheads="1"/>
+                    </pic:cNvPicPr>
+                  </pic:nvPicPr>
+                  <pic:blipFill>
+                    <a:blip r:embed="rId17" cstate="none"/>
+                    <a:srcRect/>
+                    <a:stretch>
+                      <a:fillRect/>
+                    </a:stretch>
+                  </pic:blipFill>
+                  <pic:spPr bwMode="auto">
+                    <a:xfrm>
+                      <a:off x="0" y="0"/>
+                      <a:ext cx="5715000" cy="11791950"/>
+                    </a:xfrm>
+                    <a:prstGeom prst="rect">
+                      <a:avLst/>
+                    </a:prstGeom>
+                  </pic:spPr>
+                </pic:pic>
+              </a:graphicData>
+            </a:graphic>
+          </wp:inline>
+        </w:drawing>
+      </w:r>
+    </w:p>
+    <w:p>
+      <w:pPr>
+        <w:spacing w:after="180"/>
+        <w:jc w:val="center"/>
+      </w:pPr>
+      <w:r>
+        <w:rPr>
+          <w:i/>
+          <w:iCs/>
+          <w:color w:val="666666"/>
+          <w:sz w:val="18"/>
+          <w:szCs w:val="18"/>
+        </w:rPr>
+        <w:t xml:space="preserve">Figura — tarefas marcadas como completas no emulador Android, incluindo o item "Lab3" criado na própria aplicação</w:t>
+      </w:r>
+    </w:p>
+    <w:p>
+      <w:pPr>
+        <w:spacing w:after="60" w:before="100"/>
+        <w:jc w:val="center"/>
+      </w:pPr>
+      <w:r>
+        <w:drawing>
+          <wp:inline distT="0" distB="0" distL="0" distR="0">
+            <wp:extent cx="5715000" cy="12411075"/>
+            <wp:effectExtent t="0" r="0" b="0" l="0"/>
+            <wp:docPr id="1" name="" descr="" title=""/>
+            <wp:cNvGraphicFramePr>
+              <a:graphicFrameLocks xmlns:a="http://schemas.openxmlformats.org/drawingml/2006/main" noChangeAspect="1"/>
+            </wp:cNvGraphicFramePr>
+            <a:graphic xmlns:a="http://schemas.openxmlformats.org/drawingml/2006/main">
+              <a:graphicData uri="http://schemas.openxmlformats.org/drawingml/2006/picture">
+                <pic:pic xmlns:pic="http://schemas.openxmlformats.org/drawingml/2006/picture">
+                  <pic:nvPicPr>
+                    <pic:cNvPr id="0" name="" descr=""/>
+                    <pic:cNvPicPr>
+                      <a:picLocks noChangeAspect="1" noChangeArrowheads="1"/>
+                    </pic:cNvPicPr>
+                  </pic:nvPicPr>
+                  <pic:blipFill>
+                    <a:blip r:embed="rId18" cstate="none"/>
+                    <a:srcRect/>
+                    <a:stretch>
+                      <a:fillRect/>
+                    </a:stretch>
+                  </pic:blipFill>
+                  <pic:spPr bwMode="auto">
+                    <a:xfrm>
+                      <a:off x="0" y="0"/>
+                      <a:ext cx="5715000" cy="12411075"/>
+                    </a:xfrm>
+                    <a:prstGeom prst="rect">
+                      <a:avLst/>
+                    </a:prstGeom>
+                  </pic:spPr>
+                </pic:pic>
+              </a:graphicData>
+            </a:graphic>
+          </wp:inline>
+        </w:drawing>
+      </w:r>
+    </w:p>
+    <w:p>
+      <w:pPr>
+        <w:spacing w:after="180"/>
+        <w:jc w:val="center"/>
+      </w:pPr>
+      <w:r>
+        <w:rPr>
+          <w:i/>
+          <w:iCs/>
+          <w:color w:val="666666"/>
+          <w:sz w:val="18"/>
+          <w:szCs w:val="18"/>
+        </w:rPr>
+        <w:t xml:space="preserve">Figura — tarefas marcadas como completas no iPhone</w:t>
+      </w:r>
+    </w:p>
+    <w:p>
+      <w:pPr>
+        <w:spacing w:after="120" w:before="0"/>
+      </w:pPr>
+      <w:r>
+        <w:t xml:space="preserve">A funcionalidade foi validada nas três plataformas, com a alteração a ser persistida no servidor (o estado mantém-se após recarregar a lista, confirmando a chamada PUT à API).</w:t>
       </w:r>
     </w:p>
     <w:p>
@@ -3810,7 +4328,7 @@
         <w:spacing w:after="60"/>
       </w:pPr>
       <w:r>
-        <w:t xml:space="preserve">Parte 3: cliente Flutter a correr em Desktop (macOS) e num iPhone físico (iOS), estendido com a funcionalidade de marcar tarefas como completas (API + cliente), demonstrada em ambas as plataformas.</w:t>
+        <w:t xml:space="preserve">Parte 3: cliente Flutter a correr em Desktop (macOS) e Android (emulador Pixel 9, API 36) — e ainda, como extra, num iPhone físico — estendido com a funcionalidade de marcar tarefas como completas (API + cliente), demonstrada em todas as plataformas.</w:t>
       </w:r>
     </w:p>
     <w:p>

</xml_diff>

<commit_message>
Lab3: evidencias da aplicacao base a executar no emulador Android (parte 3a completa)
</commit_message>
<xml_diff>
--- a/Lab3/Relatorio_Lab3.docx
+++ b/Lab3/Relatorio_Lab3.docx
@@ -2608,7 +2608,15 @@
         <w:spacing w:after="120" w:before="240"/>
       </w:pPr>
       <w:r>
-        <w:t xml:space="preserve">5.1. Arquitetura do cliente (Flutter)</w:t>
+        <w:t xml:space="preserve">5.0.1. Compilação e execução da aplicação base fornecida</w:t>
+      </w:r>
+    </w:p>
+    <w:p>
+      <w:pPr>
+        <w:spacing w:after="120" w:before="0"/>
+      </w:pPr>
+      <w:r>
+        <w:t xml:space="preserve">Conforme pedido no enunciado ("garanta que consegue compilar o código e executar a aplicação base"), o projeto todoapp-flutter/ foi compilado e executado no emulador Android. A compilação falhava inicialmente com o toolchain atual, tendo sido necessário diagnosticar e resolver três incompatibilidades de versões — um exercício útil de gestão de dependências:</w:t>
       </w:r>
     </w:p>
     <w:tbl>
@@ -2625,7 +2633,8 @@
       </w:tblPr>
       <w:tblGrid>
         <w:gridCol w:w="3000"/>
-        <w:gridCol w:w="6000"/>
+        <w:gridCol w:w="3000"/>
+        <w:gridCol w:w="3000"/>
       </w:tblGrid>
       <w:tr>
         <w:trPr>
@@ -2651,13 +2660,13 @@
                 <w:sz w:val="20"/>
                 <w:szCs w:val="20"/>
               </w:rPr>
-              <w:t xml:space="preserve">Ficheiro</w:t>
-            </w:r>
-          </w:p>
-        </w:tc>
-        <w:tc>
-          <w:tcPr>
-            <w:tcW w:type="dxa" w:w="6000"/>
+              <w:t xml:space="preserve">Erro observado</w:t>
+            </w:r>
+          </w:p>
+        </w:tc>
+        <w:tc>
+          <w:tcPr>
+            <w:tcW w:type="dxa" w:w="3000"/>
             <w:shd w:fill="2E4BB1" w:color="auto" w:val="clear"/>
             <w:tcMar>
               <w:top w:type="dxa" w:w="40"/>
@@ -2675,7 +2684,31 @@
                 <w:sz w:val="20"/>
                 <w:szCs w:val="20"/>
               </w:rPr>
-              <w:t xml:space="preserve">Responsabilidade</w:t>
+              <w:t xml:space="preserve">Causa</w:t>
+            </w:r>
+          </w:p>
+        </w:tc>
+        <w:tc>
+          <w:tcPr>
+            <w:tcW w:type="dxa" w:w="3000"/>
+            <w:shd w:fill="2E4BB1" w:color="auto" w:val="clear"/>
+            <w:tcMar>
+              <w:top w:type="dxa" w:w="40"/>
+              <w:left w:type="dxa" w:w="80"/>
+              <w:bottom w:type="dxa" w:w="40"/>
+              <w:right w:type="dxa" w:w="80"/>
+            </w:tcMar>
+          </w:tcPr>
+          <w:p>
+            <w:r>
+              <w:rPr>
+                <w:b/>
+                <w:bCs/>
+                <w:color w:val="FFFFFF"/>
+                <w:sz w:val="20"/>
+                <w:szCs w:val="20"/>
+              </w:rPr>
+              <w:t xml:space="preserve">Correção aplicada</w:t>
             </w:r>
           </w:p>
         </w:tc>
@@ -2702,29 +2735,51 @@
                 <w:sz w:val="20"/>
                 <w:szCs w:val="20"/>
               </w:rPr>
-              <w:t xml:space="preserve">lib/models.dart</w:t>
-            </w:r>
-          </w:p>
-        </w:tc>
-        <w:tc>
-          <w:tcPr>
-            <w:tcW w:type="dxa" w:w="6000"/>
-            <w:tcMar>
-              <w:top w:type="dxa" w:w="40"/>
-              <w:left w:type="dxa" w:w="80"/>
-              <w:bottom w:type="dxa" w:w="40"/>
-              <w:right w:type="dxa" w:w="80"/>
-            </w:tcMar>
-          </w:tcPr>
-          <w:p>
-            <w:r>
-              <w:rPr>
-                <w:b w:val="false"/>
-                <w:bCs w:val="false"/>
-                <w:sz w:val="20"/>
-                <w:szCs w:val="20"/>
-              </w:rPr>
-              <w:t xml:space="preserve">Modelos TodoList e Todo (desserialização do JSON da API)</w:t>
+              <w:t xml:space="preserve">Unsupported class file major version 65</w:t>
+            </w:r>
+          </w:p>
+        </w:tc>
+        <w:tc>
+          <w:tcPr>
+            <w:tcW w:type="dxa" w:w="3000"/>
+            <w:tcMar>
+              <w:top w:type="dxa" w:w="40"/>
+              <w:left w:type="dxa" w:w="80"/>
+              <w:bottom w:type="dxa" w:w="40"/>
+              <w:right w:type="dxa" w:w="80"/>
+            </w:tcMar>
+          </w:tcPr>
+          <w:p>
+            <w:r>
+              <w:rPr>
+                <w:b w:val="false"/>
+                <w:bCs w:val="false"/>
+                <w:sz w:val="20"/>
+                <w:szCs w:val="20"/>
+              </w:rPr>
+              <w:t xml:space="preserve">Gradle 7.6.3 não suporta Java 21 (JDK do Android Studio)</w:t>
+            </w:r>
+          </w:p>
+        </w:tc>
+        <w:tc>
+          <w:tcPr>
+            <w:tcW w:type="dxa" w:w="3000"/>
+            <w:tcMar>
+              <w:top w:type="dxa" w:w="40"/>
+              <w:left w:type="dxa" w:w="80"/>
+              <w:bottom w:type="dxa" w:w="40"/>
+              <w:right w:type="dxa" w:w="80"/>
+            </w:tcMar>
+          </w:tcPr>
+          <w:p>
+            <w:r>
+              <w:rPr>
+                <w:b w:val="false"/>
+                <w:bCs w:val="false"/>
+                <w:sz w:val="20"/>
+                <w:szCs w:val="20"/>
+              </w:rPr>
+              <w:t xml:space="preserve">Gradle wrapper 7.6.3 → 8.9</w:t>
             </w:r>
           </w:p>
         </w:tc>
@@ -2751,29 +2806,51 @@
                 <w:sz w:val="20"/>
                 <w:szCs w:val="20"/>
               </w:rPr>
-              <w:t xml:space="preserve">lib/api_client.dart</w:t>
-            </w:r>
-          </w:p>
-        </w:tc>
-        <w:tc>
-          <w:tcPr>
-            <w:tcW w:type="dxa" w:w="6000"/>
-            <w:tcMar>
-              <w:top w:type="dxa" w:w="40"/>
-              <w:left w:type="dxa" w:w="80"/>
-              <w:bottom w:type="dxa" w:w="40"/>
-              <w:right w:type="dxa" w:w="80"/>
-            </w:tcMar>
-          </w:tcPr>
-          <w:p>
-            <w:r>
-              <w:rPr>
-                <w:b w:val="false"/>
-                <w:bCs w:val="false"/>
-                <w:sz w:val="20"/>
-                <w:szCs w:val="20"/>
-              </w:rPr>
-              <w:t xml:space="preserve">Cliente HTTP: login, getLists, createList, getTodos, createTodo, setCompleted, deleteTodo</w:t>
+              <w:t xml:space="preserve">Gradle version is lower than Flutter's minimum supported version of 8.7.0</w:t>
+            </w:r>
+          </w:p>
+        </w:tc>
+        <w:tc>
+          <w:tcPr>
+            <w:tcW w:type="dxa" w:w="3000"/>
+            <w:tcMar>
+              <w:top w:type="dxa" w:w="40"/>
+              <w:left w:type="dxa" w:w="80"/>
+              <w:bottom w:type="dxa" w:w="40"/>
+              <w:right w:type="dxa" w:w="80"/>
+            </w:tcMar>
+          </w:tcPr>
+          <w:p>
+            <w:r>
+              <w:rPr>
+                <w:b w:val="false"/>
+                <w:bCs w:val="false"/>
+                <w:sz w:val="20"/>
+                <w:szCs w:val="20"/>
+              </w:rPr>
+              <w:t xml:space="preserve">O Flutter atual exige Gradle ≥ 8.7</w:t>
+            </w:r>
+          </w:p>
+        </w:tc>
+        <w:tc>
+          <w:tcPr>
+            <w:tcW w:type="dxa" w:w="3000"/>
+            <w:tcMar>
+              <w:top w:type="dxa" w:w="40"/>
+              <w:left w:type="dxa" w:w="80"/>
+              <w:bottom w:type="dxa" w:w="40"/>
+              <w:right w:type="dxa" w:w="80"/>
+            </w:tcMar>
+          </w:tcPr>
+          <w:p>
+            <w:r>
+              <w:rPr>
+                <w:b w:val="false"/>
+                <w:bCs w:val="false"/>
+                <w:sz w:val="20"/>
+                <w:szCs w:val="20"/>
+              </w:rPr>
+              <w:t xml:space="preserve">Confirmada a versão 8.9; AGP 7.3.0 → 8.6.0, Kotlin 1.7.10 → 1.9.0</w:t>
             </w:r>
           </w:p>
         </w:tc>
@@ -2800,29 +2877,51 @@
                 <w:sz w:val="20"/>
                 <w:szCs w:val="20"/>
               </w:rPr>
-              <w:t xml:space="preserve">lib/main.dart</w:t>
-            </w:r>
-          </w:p>
-        </w:tc>
-        <w:tc>
-          <w:tcPr>
-            <w:tcW w:type="dxa" w:w="6000"/>
-            <w:tcMar>
-              <w:top w:type="dxa" w:w="40"/>
-              <w:left w:type="dxa" w:w="80"/>
-              <w:bottom w:type="dxa" w:w="40"/>
-              <w:right w:type="dxa" w:w="80"/>
-            </w:tcMar>
-          </w:tcPr>
-          <w:p>
-            <w:r>
-              <w:rPr>
-                <w:b w:val="false"/>
-                <w:bCs w:val="false"/>
-                <w:sz w:val="20"/>
-                <w:szCs w:val="20"/>
-              </w:rPr>
-              <w:t xml:space="preserve">Interface: ecrãs de Login → Listas → Tarefas</w:t>
+              <w:t xml:space="preserve">Inconsistent JVM-target compatibility (1.8) e (21)</w:t>
+            </w:r>
+          </w:p>
+        </w:tc>
+        <w:tc>
+          <w:tcPr>
+            <w:tcW w:type="dxa" w:w="3000"/>
+            <w:tcMar>
+              <w:top w:type="dxa" w:w="40"/>
+              <w:left w:type="dxa" w:w="80"/>
+              <w:bottom w:type="dxa" w:w="40"/>
+              <w:right w:type="dxa" w:w="80"/>
+            </w:tcMar>
+          </w:tcPr>
+          <w:p>
+            <w:r>
+              <w:rPr>
+                <w:b w:val="false"/>
+                <w:bCs w:val="false"/>
+                <w:sz w:val="20"/>
+                <w:szCs w:val="20"/>
+              </w:rPr>
+              <w:t xml:space="preserve">compileOptions em Java 8 mas Kotlin a compilar para 21</w:t>
+            </w:r>
+          </w:p>
+        </w:tc>
+        <w:tc>
+          <w:tcPr>
+            <w:tcW w:type="dxa" w:w="3000"/>
+            <w:tcMar>
+              <w:top w:type="dxa" w:w="40"/>
+              <w:left w:type="dxa" w:w="80"/>
+              <w:bottom w:type="dxa" w:w="40"/>
+              <w:right w:type="dxa" w:w="80"/>
+            </w:tcMar>
+          </w:tcPr>
+          <w:p>
+            <w:r>
+              <w:rPr>
+                <w:b w:val="false"/>
+                <w:bCs w:val="false"/>
+                <w:sz w:val="20"/>
+                <w:szCs w:val="20"/>
+              </w:rPr>
+              <w:t xml:space="preserve">sourceCompatibility/targetCompatibility → 17 e kotlinOptions.jvmTarget → 17</w:t>
             </w:r>
           </w:p>
         </w:tc>
@@ -2833,356 +2932,7 @@
         <w:spacing w:after="120" w:before="0"/>
       </w:pPr>
       <w:r>
-        <w:t xml:space="preserve">O endereço da API adapta-se à plataforma: http://localhost:7100 no Desktop, http://10.0.2.2:7100 no emulador Android, e o IP do anfitrião na rede local num dispositivo físico (campo "Servidor" editável no login). O token "Bearer &lt;username&gt;" devolvido pelo login é enviado tal e qual no header Authorization.</w:t>
-      </w:r>
-    </w:p>
-    <w:p>
-      <w:pPr>
-        <w:pStyle w:val="Heading2"/>
-        <w:spacing w:after="120" w:before="240"/>
-      </w:pPr>
-      <w:r>
-        <w:t xml:space="preserve">5.2. a) Execução em Desktop e em dispositivo móvel</w:t>
-      </w:r>
-    </w:p>
-    <w:p>
-      <w:pPr>
-        <w:spacing w:after="120" w:before="0"/>
-      </w:pPr>
-      <w:r>
-        <w:t xml:space="preserve">Preparação (uma vez): flutter pub get e flutter create --platforms=android,ios,macos . Execução: flutter run -d macos (Desktop) ou flutter run -d &lt;dispositivo&gt; (móvel).</w:t>
-      </w:r>
-    </w:p>
-    <w:p>
-      <w:pPr>
-        <w:spacing w:after="120" w:before="0"/>
-      </w:pPr>
-      <w:r>
-        <w:t xml:space="preserve">A aplicação foi testada nas três plataformas a partir da mesma base de código:</w:t>
-      </w:r>
-    </w:p>
-    <w:tbl>
-      <w:tblPr>
-        <w:tblW w:type="dxa" w:w="9000"/>
-        <w:tblBorders>
-          <w:top w:val="single" w:color="auto" w:sz="4"/>
-          <w:left w:val="single" w:color="auto" w:sz="4"/>
-          <w:bottom w:val="single" w:color="auto" w:sz="4"/>
-          <w:right w:val="single" w:color="auto" w:sz="4"/>
-          <w:insideH w:val="single" w:color="auto" w:sz="4"/>
-          <w:insideV w:val="single" w:color="auto" w:sz="4"/>
-        </w:tblBorders>
-      </w:tblPr>
-      <w:tblGrid>
-        <w:gridCol w:w="1800"/>
-        <w:gridCol w:w="3800"/>
-        <w:gridCol w:w="3400"/>
-      </w:tblGrid>
-      <w:tr>
-        <w:trPr>
-          <w:tblHeader/>
-        </w:trPr>
-        <w:tc>
-          <w:tcPr>
-            <w:tcW w:type="dxa" w:w="1800"/>
-            <w:shd w:fill="2E4BB1" w:color="auto" w:val="clear"/>
-            <w:tcMar>
-              <w:top w:type="dxa" w:w="40"/>
-              <w:left w:type="dxa" w:w="80"/>
-              <w:bottom w:type="dxa" w:w="40"/>
-              <w:right w:type="dxa" w:w="80"/>
-            </w:tcMar>
-          </w:tcPr>
-          <w:p>
-            <w:r>
-              <w:rPr>
-                <w:b/>
-                <w:bCs/>
-                <w:color w:val="FFFFFF"/>
-                <w:sz w:val="20"/>
-                <w:szCs w:val="20"/>
-              </w:rPr>
-              <w:t xml:space="preserve">Plataforma</w:t>
-            </w:r>
-          </w:p>
-        </w:tc>
-        <w:tc>
-          <w:tcPr>
-            <w:tcW w:type="dxa" w:w="3800"/>
-            <w:shd w:fill="2E4BB1" w:color="auto" w:val="clear"/>
-            <w:tcMar>
-              <w:top w:type="dxa" w:w="40"/>
-              <w:left w:type="dxa" w:w="80"/>
-              <w:bottom w:type="dxa" w:w="40"/>
-              <w:right w:type="dxa" w:w="80"/>
-            </w:tcMar>
-          </w:tcPr>
-          <w:p>
-            <w:r>
-              <w:rPr>
-                <w:b/>
-                <w:bCs/>
-                <w:color w:val="FFFFFF"/>
-                <w:sz w:val="20"/>
-                <w:szCs w:val="20"/>
-              </w:rPr>
-              <w:t xml:space="preserve">Ambiente</w:t>
-            </w:r>
-          </w:p>
-        </w:tc>
-        <w:tc>
-          <w:tcPr>
-            <w:tcW w:type="dxa" w:w="3400"/>
-            <w:shd w:fill="2E4BB1" w:color="auto" w:val="clear"/>
-            <w:tcMar>
-              <w:top w:type="dxa" w:w="40"/>
-              <w:left w:type="dxa" w:w="80"/>
-              <w:bottom w:type="dxa" w:w="40"/>
-              <w:right w:type="dxa" w:w="80"/>
-            </w:tcMar>
-          </w:tcPr>
-          <w:p>
-            <w:r>
-              <w:rPr>
-                <w:b/>
-                <w:bCs/>
-                <w:color w:val="FFFFFF"/>
-                <w:sz w:val="20"/>
-                <w:szCs w:val="20"/>
-              </w:rPr>
-              <w:t xml:space="preserve">Endereço da API</w:t>
-            </w:r>
-          </w:p>
-        </w:tc>
-      </w:tr>
-      <w:tr>
-        <w:trPr>
-          <w:tblHeader w:val="false"/>
-        </w:trPr>
-        <w:tc>
-          <w:tcPr>
-            <w:tcW w:type="dxa" w:w="1800"/>
-            <w:tcMar>
-              <w:top w:type="dxa" w:w="40"/>
-              <w:left w:type="dxa" w:w="80"/>
-              <w:bottom w:type="dxa" w:w="40"/>
-              <w:right w:type="dxa" w:w="80"/>
-            </w:tcMar>
-          </w:tcPr>
-          <w:p>
-            <w:r>
-              <w:rPr>
-                <w:b w:val="false"/>
-                <w:bCs w:val="false"/>
-                <w:sz w:val="20"/>
-                <w:szCs w:val="20"/>
-              </w:rPr>
-              <w:t xml:space="preserve">Desktop</w:t>
-            </w:r>
-          </w:p>
-        </w:tc>
-        <w:tc>
-          <w:tcPr>
-            <w:tcW w:type="dxa" w:w="3800"/>
-            <w:tcMar>
-              <w:top w:type="dxa" w:w="40"/>
-              <w:left w:type="dxa" w:w="80"/>
-              <w:bottom w:type="dxa" w:w="40"/>
-              <w:right w:type="dxa" w:w="80"/>
-            </w:tcMar>
-          </w:tcPr>
-          <w:p>
-            <w:r>
-              <w:rPr>
-                <w:b w:val="false"/>
-                <w:bCs w:val="false"/>
-                <w:sz w:val="20"/>
-                <w:szCs w:val="20"/>
-              </w:rPr>
-              <w:t xml:space="preserve">macOS (target macos)</w:t>
-            </w:r>
-          </w:p>
-        </w:tc>
-        <w:tc>
-          <w:tcPr>
-            <w:tcW w:type="dxa" w:w="3400"/>
-            <w:tcMar>
-              <w:top w:type="dxa" w:w="40"/>
-              <w:left w:type="dxa" w:w="80"/>
-              <w:bottom w:type="dxa" w:w="40"/>
-              <w:right w:type="dxa" w:w="80"/>
-            </w:tcMar>
-          </w:tcPr>
-          <w:p>
-            <w:r>
-              <w:rPr>
-                <w:b w:val="false"/>
-                <w:bCs w:val="false"/>
-                <w:sz w:val="20"/>
-                <w:szCs w:val="20"/>
-              </w:rPr>
-              <w:t xml:space="preserve">http://localhost:7100 (automático)</w:t>
-            </w:r>
-          </w:p>
-        </w:tc>
-      </w:tr>
-      <w:tr>
-        <w:trPr>
-          <w:tblHeader w:val="false"/>
-        </w:trPr>
-        <w:tc>
-          <w:tcPr>
-            <w:tcW w:type="dxa" w:w="1800"/>
-            <w:tcMar>
-              <w:top w:type="dxa" w:w="40"/>
-              <w:left w:type="dxa" w:w="80"/>
-              <w:bottom w:type="dxa" w:w="40"/>
-              <w:right w:type="dxa" w:w="80"/>
-            </w:tcMar>
-          </w:tcPr>
-          <w:p>
-            <w:r>
-              <w:rPr>
-                <w:b w:val="false"/>
-                <w:bCs w:val="false"/>
-                <w:sz w:val="20"/>
-                <w:szCs w:val="20"/>
-              </w:rPr>
-              <w:t xml:space="preserve">Android</w:t>
-            </w:r>
-          </w:p>
-        </w:tc>
-        <w:tc>
-          <w:tcPr>
-            <w:tcW w:type="dxa" w:w="3800"/>
-            <w:tcMar>
-              <w:top w:type="dxa" w:w="40"/>
-              <w:left w:type="dxa" w:w="80"/>
-              <w:bottom w:type="dxa" w:w="40"/>
-              <w:right w:type="dxa" w:w="80"/>
-            </w:tcMar>
-          </w:tcPr>
-          <w:p>
-            <w:r>
-              <w:rPr>
-                <w:b w:val="false"/>
-                <w:bCs w:val="false"/>
-                <w:sz w:val="20"/>
-                <w:szCs w:val="20"/>
-              </w:rPr>
-              <w:t xml:space="preserve">Emulador Pixel 9, Android 16 (API 36), arm64</w:t>
-            </w:r>
-          </w:p>
-        </w:tc>
-        <w:tc>
-          <w:tcPr>
-            <w:tcW w:type="dxa" w:w="3400"/>
-            <w:tcMar>
-              <w:top w:type="dxa" w:w="40"/>
-              <w:left w:type="dxa" w:w="80"/>
-              <w:bottom w:type="dxa" w:w="40"/>
-              <w:right w:type="dxa" w:w="80"/>
-            </w:tcMar>
-          </w:tcPr>
-          <w:p>
-            <w:r>
-              <w:rPr>
-                <w:b w:val="false"/>
-                <w:bCs w:val="false"/>
-                <w:sz w:val="20"/>
-                <w:szCs w:val="20"/>
-              </w:rPr>
-              <w:t xml:space="preserve">http://10.0.2.2:7100 (automático)</w:t>
-            </w:r>
-          </w:p>
-        </w:tc>
-      </w:tr>
-      <w:tr>
-        <w:trPr>
-          <w:tblHeader w:val="false"/>
-        </w:trPr>
-        <w:tc>
-          <w:tcPr>
-            <w:tcW w:type="dxa" w:w="1800"/>
-            <w:tcMar>
-              <w:top w:type="dxa" w:w="40"/>
-              <w:left w:type="dxa" w:w="80"/>
-              <w:bottom w:type="dxa" w:w="40"/>
-              <w:right w:type="dxa" w:w="80"/>
-            </w:tcMar>
-          </w:tcPr>
-          <w:p>
-            <w:r>
-              <w:rPr>
-                <w:b w:val="false"/>
-                <w:bCs w:val="false"/>
-                <w:sz w:val="20"/>
-                <w:szCs w:val="20"/>
-              </w:rPr>
-              <w:t xml:space="preserve">iOS (extra)</w:t>
-            </w:r>
-          </w:p>
-        </w:tc>
-        <w:tc>
-          <w:tcPr>
-            <w:tcW w:type="dxa" w:w="3800"/>
-            <w:tcMar>
-              <w:top w:type="dxa" w:w="40"/>
-              <w:left w:type="dxa" w:w="80"/>
-              <w:bottom w:type="dxa" w:w="40"/>
-              <w:right w:type="dxa" w:w="80"/>
-            </w:tcMar>
-          </w:tcPr>
-          <w:p>
-            <w:r>
-              <w:rPr>
-                <w:b w:val="false"/>
-                <w:bCs w:val="false"/>
-                <w:sz w:val="20"/>
-                <w:szCs w:val="20"/>
-              </w:rPr>
-              <w:t xml:space="preserve">iPhone físico, assinado via Xcode</w:t>
-            </w:r>
-          </w:p>
-        </w:tc>
-        <w:tc>
-          <w:tcPr>
-            <w:tcW w:type="dxa" w:w="3400"/>
-            <w:tcMar>
-              <w:top w:type="dxa" w:w="40"/>
-              <w:left w:type="dxa" w:w="80"/>
-              <w:bottom w:type="dxa" w:w="40"/>
-              <w:right w:type="dxa" w:w="80"/>
-            </w:tcMar>
-          </w:tcPr>
-          <w:p>
-            <w:r>
-              <w:rPr>
-                <w:b w:val="false"/>
-                <w:bCs w:val="false"/>
-                <w:sz w:val="20"/>
-                <w:szCs w:val="20"/>
-              </w:rPr>
-              <w:t xml:space="preserve">http://192.168.1.64:7100 (IP do Mac na rede local)</w:t>
-            </w:r>
-          </w:p>
-        </w:tc>
-      </w:tr>
-    </w:tbl>
-    <w:p>
-      <w:pPr>
-        <w:spacing w:after="120" w:before="0"/>
-      </w:pPr>
-      <w:r>
-        <w:t xml:space="preserve">No Android, o emulador foi criado no Android Studio (Device Manager) e a aplicação instalada com flutter run -d emulator-5554; o endereço 10.0.2.2 é resolvido automaticamente pela aplicação, por ser o alias do anfitrião visto de dentro do emulador.</w:t>
-      </w:r>
-    </w:p>
-    <w:p>
-      <w:pPr>
-        <w:spacing w:after="120" w:before="0"/>
-      </w:pPr>
-      <w:r>
-        <w:t xml:space="preserve">Como demonstração adicional de portabilidade, a mesma base de código foi ainda executada num iPhone físico, ligado por cabo e assinado via Xcode (Automatically manage signing), com o campo "Servidor" apontado ao IP do Mac na rede local (ambos na mesma rede Wi-Fi).</w:t>
+        <w:t xml:space="preserve">Após estas alterações a compilação conclui com sucesso (Built build/app/outputs/flutter-apk/app-debug.apk).</w:t>
       </w:r>
     </w:p>
     <w:p>
@@ -3194,7 +2944,7 @@
           <w:b/>
           <w:bCs/>
         </w:rPr>
-        <w:t xml:space="preserve">Detalhes técnicos do deployment no iPhone (via Xcode):</w:t>
+        <w:t xml:space="preserve">Defeito funcional encontrado (duplicação do prefixo "Bearer").</w:t>
       </w:r>
     </w:p>
     <w:p>
@@ -3202,72 +2952,7 @@
         <w:spacing w:after="120" w:before="0"/>
       </w:pPr>
       <w:r>
-        <w:t xml:space="preserve">Ao contrário do Android (que empacota a aplicação num APK), no iOS a aplicação é compilada num bundle .app assinado (distribuível como .ipa) e só pode ser instalada num dispositivo físico depois de assinada com um certificado de programador. O processo seguido:</w:t>
-      </w:r>
-    </w:p>
-    <w:p>
-      <w:pPr>
-        <w:pStyle w:val="ListParagraph"/>
-        <w:numPr>
-          <w:ilvl w:val="0"/>
-          <w:numId w:val="1"/>
-        </w:numPr>
-        <w:spacing w:after="60"/>
-      </w:pPr>
-      <w:r>
-        <w:t xml:space="preserve">flutter create --platforms=ios . — gera o projeto Xcode (ios/Runner.xcworkspace); as dependências nativas são geridas pelo CocoaPods;</w:t>
-      </w:r>
-    </w:p>
-    <w:p>
-      <w:pPr>
-        <w:pStyle w:val="ListParagraph"/>
-        <w:numPr>
-          <w:ilvl w:val="0"/>
-          <w:numId w:val="1"/>
-        </w:numPr>
-        <w:spacing w:after="60"/>
-      </w:pPr>
-      <w:r>
-        <w:t xml:space="preserve">No iPhone, ativou-se o Developer Mode (Definições → Privacidade e Segurança) e ligou-se o dispositivo por cabo ao Mac;</w:t>
-      </w:r>
-    </w:p>
-    <w:p>
-      <w:pPr>
-        <w:pStyle w:val="ListParagraph"/>
-        <w:numPr>
-          <w:ilvl w:val="0"/>
-          <w:numId w:val="1"/>
-        </w:numPr>
-        <w:spacing w:after="60"/>
-      </w:pPr>
-      <w:r>
-        <w:t xml:space="preserve">No Xcode (target Runner → Signing &amp; Capabilities): ativou-se Automatically manage signing com a equipa pessoal associada ao Apple ID — o Xcode gera automaticamente o certificado de development e o provisioning profile que autorizam a instalação neste dispositivo (com conta gratuita, o perfil é válido por 7 dias);</w:t>
-      </w:r>
-    </w:p>
-    <w:p>
-      <w:pPr>
-        <w:pStyle w:val="ListParagraph"/>
-        <w:numPr>
-          <w:ilvl w:val="0"/>
-          <w:numId w:val="1"/>
-        </w:numPr>
-        <w:spacing w:after="60"/>
-      </w:pPr>
-      <w:r>
-        <w:t xml:space="preserve">flutter run -d &lt;iPhone&gt; — compila via xcodebuild, assina o .app, instala-o pelo cabo e lança a aplicação; na primeira execução foi necessário confiar no certificado no iPhone (Definições → Geral → VPN e Gestão de Dispositivos);</w:t>
-      </w:r>
-    </w:p>
-    <w:p>
-      <w:pPr>
-        <w:pStyle w:val="ListParagraph"/>
-        <w:numPr>
-          <w:ilvl w:val="0"/>
-          <w:numId w:val="1"/>
-        </w:numPr>
-        <w:spacing w:after="60"/>
-      </w:pPr>
-      <w:r>
-        <w:t xml:space="preserve">Como o dispositivo físico não vê o localhost do Mac, o campo "Servidor" do login foi apontado ao IP do anfitrião na rede local (http://192.168.1.64:7100), com o Mac e o iPhone na mesma rede Wi-Fi (a API Javalin escuta em 0.0.0.0, pelo que aceita ligações de qualquer interface sem reconfiguração).</w:t>
+        <w:t xml:space="preserve">Depois de compilar, a aplicação autenticava mas apresentava a lista vazia. A análise dos registos do servidor revelou a causa exata: "AuthorizationMiddleware - Authorization token is invalid Bearer user1".</w:t>
       </w:r>
     </w:p>
     <w:p>
@@ -3275,50 +2960,23 @@
         <w:spacing w:after="120" w:before="0"/>
       </w:pPr>
       <w:r>
-        <w:rPr>
-          <w:b/>
-          <w:bCs/>
-        </w:rPr>
-        <w:t xml:space="preserve">Notas de configuração encontradas e resolvidas:</w:t>
-      </w:r>
-    </w:p>
-    <w:p>
-      <w:pPr>
-        <w:pStyle w:val="ListParagraph"/>
-        <w:numPr>
-          <w:ilvl w:val="0"/>
-          <w:numId w:val="1"/>
-        </w:numPr>
-        <w:spacing w:after="60"/>
-      </w:pPr>
-      <w:r>
-        <w:t xml:space="preserve">macOS: a aplicação corre em sandbox e bloqueia ligações de saída por omissão. Foi adicionada a entitlement com.apple.security.network.client em macos/Runner/DebugProfile.entitlements e Release.entitlements.</w:t>
-      </w:r>
-    </w:p>
-    <w:p>
-      <w:pPr>
-        <w:pStyle w:val="ListParagraph"/>
-        <w:numPr>
-          <w:ilvl w:val="0"/>
-          <w:numId w:val="1"/>
-        </w:numPr>
-        <w:spacing w:after="60"/>
-      </w:pPr>
-      <w:r>
-        <w:t xml:space="preserve">iOS: o iOS bloqueia HTTP em claro (App Transport Security); foi adicionado NSAllowsArbitraryLoads ao ios/Runner/Info.plist (apenas para testes locais).</w:t>
-      </w:r>
-    </w:p>
-    <w:p>
-      <w:pPr>
-        <w:pStyle w:val="ListParagraph"/>
-        <w:numPr>
-          <w:ilvl w:val="0"/>
-          <w:numId w:val="1"/>
-        </w:numPr>
-        <w:spacing w:after="60"/>
-      </w:pPr>
-      <w:r>
-        <w:t xml:space="preserve">Android: como a API de teste é HTTP (não HTTPS), é necessário android:usesCleartextTraffic="true" no AndroidManifest.xml (já aplicado); a geração do APK correspondente faz-se com flutter build apk --release, exigindo o Android SDK.</w:t>
+        <w:t xml:space="preserve">O TodoUserService.login da API devolve o token já com o prefixo ("Bearer user1"), mas o cliente compunha o cabeçalho como 'Bearer $token', enviando Authorization: Bearer Bearer user1. O middleware remove os primeiros 7 caracteres ("Bearer ") e procura o utilizador "Bearer user1", que não existe — daí o 401 e a lista vazia. A correção foi enviar o token tal como a API o devolve, em lib/services/todo_service.dart: de 'Bearer $token' para apenas token.</w:t>
+      </w:r>
+    </w:p>
+    <w:p>
+      <w:pPr>
+        <w:spacing w:after="120" w:before="0"/>
+      </w:pPr>
+      <w:r>
+        <w:t xml:space="preserve">Este caso ilustra bem a importância de um contrato de API explícito: como o token já transporta o esquema de autenticação, a responsabilidade de o prefixar não pode estar também do lado do cliente. Na aplicação desenvolvida por nós esta ambiguidade foi evitada desde o início, tratando o valor devolvido pelo /login como opaco e enviando-o sem transformação.</w:t>
+      </w:r>
+    </w:p>
+    <w:p>
+      <w:pPr>
+        <w:spacing w:after="120" w:before="0"/>
+      </w:pPr>
+      <w:r>
+        <w:t xml:space="preserve">Com esta correção a aplicação base executa corretamente no emulador, autenticando e listando as listas e tarefas obtidas da API (o .env do projeto já aponta para 10.0.2.2:7100, o alias do anfitrião visto do emulador).</w:t>
       </w:r>
     </w:p>
     <w:p>
@@ -3329,7 +2987,7 @@
       <w:r>
         <w:drawing>
           <wp:inline distT="0" distB="0" distL="0" distR="0">
-            <wp:extent cx="5715000" cy="4533900"/>
+            <wp:extent cx="5715000" cy="13011150"/>
             <wp:effectExtent t="0" r="0" b="0" l="0"/>
             <wp:docPr id="1" name="" descr="" title=""/>
             <wp:cNvGraphicFramePr>
@@ -3354,7 +3012,7 @@
                   <pic:spPr bwMode="auto">
                     <a:xfrm>
                       <a:off x="0" y="0"/>
-                      <a:ext cx="5715000" cy="4533900"/>
+                      <a:ext cx="5715000" cy="13011150"/>
                     </a:xfrm>
                     <a:prstGeom prst="rect">
                       <a:avLst/>
@@ -3380,7 +3038,7 @@
           <w:sz w:val="18"/>
           <w:szCs w:val="18"/>
         </w:rPr>
-        <w:t xml:space="preserve">Figura — aplicação a correr em Desktop (macOS)</w:t>
+        <w:t xml:space="preserve">Figura — aplicação base fornecida (todoapp-flutter) a executar no emulador Android — listas obtidas da API após autenticação</w:t>
       </w:r>
     </w:p>
     <w:p>
@@ -3391,7 +3049,7 @@
       <w:r>
         <w:drawing>
           <wp:inline distT="0" distB="0" distL="0" distR="0">
-            <wp:extent cx="5715000" cy="9734550"/>
+            <wp:extent cx="5715000" cy="12458700"/>
             <wp:effectExtent t="0" r="0" b="0" l="0"/>
             <wp:docPr id="1" name="" descr="" title=""/>
             <wp:cNvGraphicFramePr>
@@ -3416,7 +3074,7 @@
                   <pic:spPr bwMode="auto">
                     <a:xfrm>
                       <a:off x="0" y="0"/>
-                      <a:ext cx="5715000" cy="9734550"/>
+                      <a:ext cx="5715000" cy="12458700"/>
                     </a:xfrm>
                     <a:prstGeom prst="rect">
                       <a:avLst/>
@@ -3442,7 +3100,726 @@
           <w:sz w:val="18"/>
           <w:szCs w:val="18"/>
         </w:rPr>
-        <w:t xml:space="preserve">Figura — login no emulador Android (Pixel 9, API 36), com o endereço 10.0.2.2 resolvido automaticamente</w:t>
+        <w:t xml:space="preserve">Figura — tarefas da lista na aplicação base. Note-se Milk: true e Cheese: true — estado de "completa" definido a partir da aplicação desenvolvida neste trabalho, confirmando que ambos os clientes partilham a mesma API e persistência</w:t>
+      </w:r>
+    </w:p>
+    <w:p>
+      <w:pPr>
+        <w:pStyle w:val="Heading2"/>
+        <w:spacing w:after="120" w:before="240"/>
+      </w:pPr>
+      <w:r>
+        <w:t xml:space="preserve">5.1. Arquitetura do cliente (Flutter)</w:t>
+      </w:r>
+    </w:p>
+    <w:tbl>
+      <w:tblPr>
+        <w:tblW w:type="dxa" w:w="9000"/>
+        <w:tblBorders>
+          <w:top w:val="single" w:color="auto" w:sz="4"/>
+          <w:left w:val="single" w:color="auto" w:sz="4"/>
+          <w:bottom w:val="single" w:color="auto" w:sz="4"/>
+          <w:right w:val="single" w:color="auto" w:sz="4"/>
+          <w:insideH w:val="single" w:color="auto" w:sz="4"/>
+          <w:insideV w:val="single" w:color="auto" w:sz="4"/>
+        </w:tblBorders>
+      </w:tblPr>
+      <w:tblGrid>
+        <w:gridCol w:w="3000"/>
+        <w:gridCol w:w="6000"/>
+      </w:tblGrid>
+      <w:tr>
+        <w:trPr>
+          <w:tblHeader/>
+        </w:trPr>
+        <w:tc>
+          <w:tcPr>
+            <w:tcW w:type="dxa" w:w="3000"/>
+            <w:shd w:fill="2E4BB1" w:color="auto" w:val="clear"/>
+            <w:tcMar>
+              <w:top w:type="dxa" w:w="40"/>
+              <w:left w:type="dxa" w:w="80"/>
+              <w:bottom w:type="dxa" w:w="40"/>
+              <w:right w:type="dxa" w:w="80"/>
+            </w:tcMar>
+          </w:tcPr>
+          <w:p>
+            <w:r>
+              <w:rPr>
+                <w:b/>
+                <w:bCs/>
+                <w:color w:val="FFFFFF"/>
+                <w:sz w:val="20"/>
+                <w:szCs w:val="20"/>
+              </w:rPr>
+              <w:t xml:space="preserve">Ficheiro</w:t>
+            </w:r>
+          </w:p>
+        </w:tc>
+        <w:tc>
+          <w:tcPr>
+            <w:tcW w:type="dxa" w:w="6000"/>
+            <w:shd w:fill="2E4BB1" w:color="auto" w:val="clear"/>
+            <w:tcMar>
+              <w:top w:type="dxa" w:w="40"/>
+              <w:left w:type="dxa" w:w="80"/>
+              <w:bottom w:type="dxa" w:w="40"/>
+              <w:right w:type="dxa" w:w="80"/>
+            </w:tcMar>
+          </w:tcPr>
+          <w:p>
+            <w:r>
+              <w:rPr>
+                <w:b/>
+                <w:bCs/>
+                <w:color w:val="FFFFFF"/>
+                <w:sz w:val="20"/>
+                <w:szCs w:val="20"/>
+              </w:rPr>
+              <w:t xml:space="preserve">Responsabilidade</w:t>
+            </w:r>
+          </w:p>
+        </w:tc>
+      </w:tr>
+      <w:tr>
+        <w:trPr>
+          <w:tblHeader w:val="false"/>
+        </w:trPr>
+        <w:tc>
+          <w:tcPr>
+            <w:tcW w:type="dxa" w:w="3000"/>
+            <w:tcMar>
+              <w:top w:type="dxa" w:w="40"/>
+              <w:left w:type="dxa" w:w="80"/>
+              <w:bottom w:type="dxa" w:w="40"/>
+              <w:right w:type="dxa" w:w="80"/>
+            </w:tcMar>
+          </w:tcPr>
+          <w:p>
+            <w:r>
+              <w:rPr>
+                <w:b w:val="false"/>
+                <w:bCs w:val="false"/>
+                <w:sz w:val="20"/>
+                <w:szCs w:val="20"/>
+              </w:rPr>
+              <w:t xml:space="preserve">lib/models.dart</w:t>
+            </w:r>
+          </w:p>
+        </w:tc>
+        <w:tc>
+          <w:tcPr>
+            <w:tcW w:type="dxa" w:w="6000"/>
+            <w:tcMar>
+              <w:top w:type="dxa" w:w="40"/>
+              <w:left w:type="dxa" w:w="80"/>
+              <w:bottom w:type="dxa" w:w="40"/>
+              <w:right w:type="dxa" w:w="80"/>
+            </w:tcMar>
+          </w:tcPr>
+          <w:p>
+            <w:r>
+              <w:rPr>
+                <w:b w:val="false"/>
+                <w:bCs w:val="false"/>
+                <w:sz w:val="20"/>
+                <w:szCs w:val="20"/>
+              </w:rPr>
+              <w:t xml:space="preserve">Modelos TodoList e Todo (desserialização do JSON da API)</w:t>
+            </w:r>
+          </w:p>
+        </w:tc>
+      </w:tr>
+      <w:tr>
+        <w:trPr>
+          <w:tblHeader w:val="false"/>
+        </w:trPr>
+        <w:tc>
+          <w:tcPr>
+            <w:tcW w:type="dxa" w:w="3000"/>
+            <w:tcMar>
+              <w:top w:type="dxa" w:w="40"/>
+              <w:left w:type="dxa" w:w="80"/>
+              <w:bottom w:type="dxa" w:w="40"/>
+              <w:right w:type="dxa" w:w="80"/>
+            </w:tcMar>
+          </w:tcPr>
+          <w:p>
+            <w:r>
+              <w:rPr>
+                <w:b w:val="false"/>
+                <w:bCs w:val="false"/>
+                <w:sz w:val="20"/>
+                <w:szCs w:val="20"/>
+              </w:rPr>
+              <w:t xml:space="preserve">lib/api_client.dart</w:t>
+            </w:r>
+          </w:p>
+        </w:tc>
+        <w:tc>
+          <w:tcPr>
+            <w:tcW w:type="dxa" w:w="6000"/>
+            <w:tcMar>
+              <w:top w:type="dxa" w:w="40"/>
+              <w:left w:type="dxa" w:w="80"/>
+              <w:bottom w:type="dxa" w:w="40"/>
+              <w:right w:type="dxa" w:w="80"/>
+            </w:tcMar>
+          </w:tcPr>
+          <w:p>
+            <w:r>
+              <w:rPr>
+                <w:b w:val="false"/>
+                <w:bCs w:val="false"/>
+                <w:sz w:val="20"/>
+                <w:szCs w:val="20"/>
+              </w:rPr>
+              <w:t xml:space="preserve">Cliente HTTP: login, getLists, createList, getTodos, createTodo, setCompleted, deleteTodo</w:t>
+            </w:r>
+          </w:p>
+        </w:tc>
+      </w:tr>
+      <w:tr>
+        <w:trPr>
+          <w:tblHeader w:val="false"/>
+        </w:trPr>
+        <w:tc>
+          <w:tcPr>
+            <w:tcW w:type="dxa" w:w="3000"/>
+            <w:tcMar>
+              <w:top w:type="dxa" w:w="40"/>
+              <w:left w:type="dxa" w:w="80"/>
+              <w:bottom w:type="dxa" w:w="40"/>
+              <w:right w:type="dxa" w:w="80"/>
+            </w:tcMar>
+          </w:tcPr>
+          <w:p>
+            <w:r>
+              <w:rPr>
+                <w:b w:val="false"/>
+                <w:bCs w:val="false"/>
+                <w:sz w:val="20"/>
+                <w:szCs w:val="20"/>
+              </w:rPr>
+              <w:t xml:space="preserve">lib/main.dart</w:t>
+            </w:r>
+          </w:p>
+        </w:tc>
+        <w:tc>
+          <w:tcPr>
+            <w:tcW w:type="dxa" w:w="6000"/>
+            <w:tcMar>
+              <w:top w:type="dxa" w:w="40"/>
+              <w:left w:type="dxa" w:w="80"/>
+              <w:bottom w:type="dxa" w:w="40"/>
+              <w:right w:type="dxa" w:w="80"/>
+            </w:tcMar>
+          </w:tcPr>
+          <w:p>
+            <w:r>
+              <w:rPr>
+                <w:b w:val="false"/>
+                <w:bCs w:val="false"/>
+                <w:sz w:val="20"/>
+                <w:szCs w:val="20"/>
+              </w:rPr>
+              <w:t xml:space="preserve">Interface: ecrãs de Login → Listas → Tarefas</w:t>
+            </w:r>
+          </w:p>
+        </w:tc>
+      </w:tr>
+    </w:tbl>
+    <w:p>
+      <w:pPr>
+        <w:spacing w:after="120" w:before="0"/>
+      </w:pPr>
+      <w:r>
+        <w:t xml:space="preserve">O endereço da API adapta-se à plataforma: http://localhost:7100 no Desktop, http://10.0.2.2:7100 no emulador Android, e o IP do anfitrião na rede local num dispositivo físico (campo "Servidor" editável no login). O token "Bearer &lt;username&gt;" devolvido pelo login é enviado tal e qual no header Authorization.</w:t>
+      </w:r>
+    </w:p>
+    <w:p>
+      <w:pPr>
+        <w:pStyle w:val="Heading2"/>
+        <w:spacing w:after="120" w:before="240"/>
+      </w:pPr>
+      <w:r>
+        <w:t xml:space="preserve">5.2. a) Execução em Desktop e em dispositivo móvel</w:t>
+      </w:r>
+    </w:p>
+    <w:p>
+      <w:pPr>
+        <w:spacing w:after="120" w:before="0"/>
+      </w:pPr>
+      <w:r>
+        <w:t xml:space="preserve">Preparação (uma vez): flutter pub get e flutter create --platforms=android,ios,macos . Execução: flutter run -d macos (Desktop) ou flutter run -d &lt;dispositivo&gt; (móvel).</w:t>
+      </w:r>
+    </w:p>
+    <w:p>
+      <w:pPr>
+        <w:spacing w:after="120" w:before="0"/>
+      </w:pPr>
+      <w:r>
+        <w:t xml:space="preserve">A aplicação foi testada nas três plataformas a partir da mesma base de código:</w:t>
+      </w:r>
+    </w:p>
+    <w:tbl>
+      <w:tblPr>
+        <w:tblW w:type="dxa" w:w="9000"/>
+        <w:tblBorders>
+          <w:top w:val="single" w:color="auto" w:sz="4"/>
+          <w:left w:val="single" w:color="auto" w:sz="4"/>
+          <w:bottom w:val="single" w:color="auto" w:sz="4"/>
+          <w:right w:val="single" w:color="auto" w:sz="4"/>
+          <w:insideH w:val="single" w:color="auto" w:sz="4"/>
+          <w:insideV w:val="single" w:color="auto" w:sz="4"/>
+        </w:tblBorders>
+      </w:tblPr>
+      <w:tblGrid>
+        <w:gridCol w:w="1800"/>
+        <w:gridCol w:w="3800"/>
+        <w:gridCol w:w="3400"/>
+      </w:tblGrid>
+      <w:tr>
+        <w:trPr>
+          <w:tblHeader/>
+        </w:trPr>
+        <w:tc>
+          <w:tcPr>
+            <w:tcW w:type="dxa" w:w="1800"/>
+            <w:shd w:fill="2E4BB1" w:color="auto" w:val="clear"/>
+            <w:tcMar>
+              <w:top w:type="dxa" w:w="40"/>
+              <w:left w:type="dxa" w:w="80"/>
+              <w:bottom w:type="dxa" w:w="40"/>
+              <w:right w:type="dxa" w:w="80"/>
+            </w:tcMar>
+          </w:tcPr>
+          <w:p>
+            <w:r>
+              <w:rPr>
+                <w:b/>
+                <w:bCs/>
+                <w:color w:val="FFFFFF"/>
+                <w:sz w:val="20"/>
+                <w:szCs w:val="20"/>
+              </w:rPr>
+              <w:t xml:space="preserve">Plataforma</w:t>
+            </w:r>
+          </w:p>
+        </w:tc>
+        <w:tc>
+          <w:tcPr>
+            <w:tcW w:type="dxa" w:w="3800"/>
+            <w:shd w:fill="2E4BB1" w:color="auto" w:val="clear"/>
+            <w:tcMar>
+              <w:top w:type="dxa" w:w="40"/>
+              <w:left w:type="dxa" w:w="80"/>
+              <w:bottom w:type="dxa" w:w="40"/>
+              <w:right w:type="dxa" w:w="80"/>
+            </w:tcMar>
+          </w:tcPr>
+          <w:p>
+            <w:r>
+              <w:rPr>
+                <w:b/>
+                <w:bCs/>
+                <w:color w:val="FFFFFF"/>
+                <w:sz w:val="20"/>
+                <w:szCs w:val="20"/>
+              </w:rPr>
+              <w:t xml:space="preserve">Ambiente</w:t>
+            </w:r>
+          </w:p>
+        </w:tc>
+        <w:tc>
+          <w:tcPr>
+            <w:tcW w:type="dxa" w:w="3400"/>
+            <w:shd w:fill="2E4BB1" w:color="auto" w:val="clear"/>
+            <w:tcMar>
+              <w:top w:type="dxa" w:w="40"/>
+              <w:left w:type="dxa" w:w="80"/>
+              <w:bottom w:type="dxa" w:w="40"/>
+              <w:right w:type="dxa" w:w="80"/>
+            </w:tcMar>
+          </w:tcPr>
+          <w:p>
+            <w:r>
+              <w:rPr>
+                <w:b/>
+                <w:bCs/>
+                <w:color w:val="FFFFFF"/>
+                <w:sz w:val="20"/>
+                <w:szCs w:val="20"/>
+              </w:rPr>
+              <w:t xml:space="preserve">Endereço da API</w:t>
+            </w:r>
+          </w:p>
+        </w:tc>
+      </w:tr>
+      <w:tr>
+        <w:trPr>
+          <w:tblHeader w:val="false"/>
+        </w:trPr>
+        <w:tc>
+          <w:tcPr>
+            <w:tcW w:type="dxa" w:w="1800"/>
+            <w:tcMar>
+              <w:top w:type="dxa" w:w="40"/>
+              <w:left w:type="dxa" w:w="80"/>
+              <w:bottom w:type="dxa" w:w="40"/>
+              <w:right w:type="dxa" w:w="80"/>
+            </w:tcMar>
+          </w:tcPr>
+          <w:p>
+            <w:r>
+              <w:rPr>
+                <w:b w:val="false"/>
+                <w:bCs w:val="false"/>
+                <w:sz w:val="20"/>
+                <w:szCs w:val="20"/>
+              </w:rPr>
+              <w:t xml:space="preserve">Desktop</w:t>
+            </w:r>
+          </w:p>
+        </w:tc>
+        <w:tc>
+          <w:tcPr>
+            <w:tcW w:type="dxa" w:w="3800"/>
+            <w:tcMar>
+              <w:top w:type="dxa" w:w="40"/>
+              <w:left w:type="dxa" w:w="80"/>
+              <w:bottom w:type="dxa" w:w="40"/>
+              <w:right w:type="dxa" w:w="80"/>
+            </w:tcMar>
+          </w:tcPr>
+          <w:p>
+            <w:r>
+              <w:rPr>
+                <w:b w:val="false"/>
+                <w:bCs w:val="false"/>
+                <w:sz w:val="20"/>
+                <w:szCs w:val="20"/>
+              </w:rPr>
+              <w:t xml:space="preserve">macOS (target macos)</w:t>
+            </w:r>
+          </w:p>
+        </w:tc>
+        <w:tc>
+          <w:tcPr>
+            <w:tcW w:type="dxa" w:w="3400"/>
+            <w:tcMar>
+              <w:top w:type="dxa" w:w="40"/>
+              <w:left w:type="dxa" w:w="80"/>
+              <w:bottom w:type="dxa" w:w="40"/>
+              <w:right w:type="dxa" w:w="80"/>
+            </w:tcMar>
+          </w:tcPr>
+          <w:p>
+            <w:r>
+              <w:rPr>
+                <w:b w:val="false"/>
+                <w:bCs w:val="false"/>
+                <w:sz w:val="20"/>
+                <w:szCs w:val="20"/>
+              </w:rPr>
+              <w:t xml:space="preserve">http://localhost:7100 (automático)</w:t>
+            </w:r>
+          </w:p>
+        </w:tc>
+      </w:tr>
+      <w:tr>
+        <w:trPr>
+          <w:tblHeader w:val="false"/>
+        </w:trPr>
+        <w:tc>
+          <w:tcPr>
+            <w:tcW w:type="dxa" w:w="1800"/>
+            <w:tcMar>
+              <w:top w:type="dxa" w:w="40"/>
+              <w:left w:type="dxa" w:w="80"/>
+              <w:bottom w:type="dxa" w:w="40"/>
+              <w:right w:type="dxa" w:w="80"/>
+            </w:tcMar>
+          </w:tcPr>
+          <w:p>
+            <w:r>
+              <w:rPr>
+                <w:b w:val="false"/>
+                <w:bCs w:val="false"/>
+                <w:sz w:val="20"/>
+                <w:szCs w:val="20"/>
+              </w:rPr>
+              <w:t xml:space="preserve">Android</w:t>
+            </w:r>
+          </w:p>
+        </w:tc>
+        <w:tc>
+          <w:tcPr>
+            <w:tcW w:type="dxa" w:w="3800"/>
+            <w:tcMar>
+              <w:top w:type="dxa" w:w="40"/>
+              <w:left w:type="dxa" w:w="80"/>
+              <w:bottom w:type="dxa" w:w="40"/>
+              <w:right w:type="dxa" w:w="80"/>
+            </w:tcMar>
+          </w:tcPr>
+          <w:p>
+            <w:r>
+              <w:rPr>
+                <w:b w:val="false"/>
+                <w:bCs w:val="false"/>
+                <w:sz w:val="20"/>
+                <w:szCs w:val="20"/>
+              </w:rPr>
+              <w:t xml:space="preserve">Emulador Pixel 9, Android 16 (API 36), arm64</w:t>
+            </w:r>
+          </w:p>
+        </w:tc>
+        <w:tc>
+          <w:tcPr>
+            <w:tcW w:type="dxa" w:w="3400"/>
+            <w:tcMar>
+              <w:top w:type="dxa" w:w="40"/>
+              <w:left w:type="dxa" w:w="80"/>
+              <w:bottom w:type="dxa" w:w="40"/>
+              <w:right w:type="dxa" w:w="80"/>
+            </w:tcMar>
+          </w:tcPr>
+          <w:p>
+            <w:r>
+              <w:rPr>
+                <w:b w:val="false"/>
+                <w:bCs w:val="false"/>
+                <w:sz w:val="20"/>
+                <w:szCs w:val="20"/>
+              </w:rPr>
+              <w:t xml:space="preserve">http://10.0.2.2:7100 (automático)</w:t>
+            </w:r>
+          </w:p>
+        </w:tc>
+      </w:tr>
+      <w:tr>
+        <w:trPr>
+          <w:tblHeader w:val="false"/>
+        </w:trPr>
+        <w:tc>
+          <w:tcPr>
+            <w:tcW w:type="dxa" w:w="1800"/>
+            <w:tcMar>
+              <w:top w:type="dxa" w:w="40"/>
+              <w:left w:type="dxa" w:w="80"/>
+              <w:bottom w:type="dxa" w:w="40"/>
+              <w:right w:type="dxa" w:w="80"/>
+            </w:tcMar>
+          </w:tcPr>
+          <w:p>
+            <w:r>
+              <w:rPr>
+                <w:b w:val="false"/>
+                <w:bCs w:val="false"/>
+                <w:sz w:val="20"/>
+                <w:szCs w:val="20"/>
+              </w:rPr>
+              <w:t xml:space="preserve">iOS (extra)</w:t>
+            </w:r>
+          </w:p>
+        </w:tc>
+        <w:tc>
+          <w:tcPr>
+            <w:tcW w:type="dxa" w:w="3800"/>
+            <w:tcMar>
+              <w:top w:type="dxa" w:w="40"/>
+              <w:left w:type="dxa" w:w="80"/>
+              <w:bottom w:type="dxa" w:w="40"/>
+              <w:right w:type="dxa" w:w="80"/>
+            </w:tcMar>
+          </w:tcPr>
+          <w:p>
+            <w:r>
+              <w:rPr>
+                <w:b w:val="false"/>
+                <w:bCs w:val="false"/>
+                <w:sz w:val="20"/>
+                <w:szCs w:val="20"/>
+              </w:rPr>
+              <w:t xml:space="preserve">iPhone físico, assinado via Xcode</w:t>
+            </w:r>
+          </w:p>
+        </w:tc>
+        <w:tc>
+          <w:tcPr>
+            <w:tcW w:type="dxa" w:w="3400"/>
+            <w:tcMar>
+              <w:top w:type="dxa" w:w="40"/>
+              <w:left w:type="dxa" w:w="80"/>
+              <w:bottom w:type="dxa" w:w="40"/>
+              <w:right w:type="dxa" w:w="80"/>
+            </w:tcMar>
+          </w:tcPr>
+          <w:p>
+            <w:r>
+              <w:rPr>
+                <w:b w:val="false"/>
+                <w:bCs w:val="false"/>
+                <w:sz w:val="20"/>
+                <w:szCs w:val="20"/>
+              </w:rPr>
+              <w:t xml:space="preserve">http://192.168.1.64:7100 (IP do Mac na rede local)</w:t>
+            </w:r>
+          </w:p>
+        </w:tc>
+      </w:tr>
+    </w:tbl>
+    <w:p>
+      <w:pPr>
+        <w:spacing w:after="120" w:before="0"/>
+      </w:pPr>
+      <w:r>
+        <w:t xml:space="preserve">No Android, o emulador foi criado no Android Studio (Device Manager) e a aplicação instalada com flutter run -d emulator-5554; o endereço 10.0.2.2 é resolvido automaticamente pela aplicação, por ser o alias do anfitrião visto de dentro do emulador.</w:t>
+      </w:r>
+    </w:p>
+    <w:p>
+      <w:pPr>
+        <w:spacing w:after="120" w:before="0"/>
+      </w:pPr>
+      <w:r>
+        <w:t xml:space="preserve">Como demonstração adicional de portabilidade, a mesma base de código foi ainda executada num iPhone físico, ligado por cabo e assinado via Xcode (Automatically manage signing), com o campo "Servidor" apontado ao IP do Mac na rede local (ambos na mesma rede Wi-Fi).</w:t>
+      </w:r>
+    </w:p>
+    <w:p>
+      <w:pPr>
+        <w:spacing w:after="120" w:before="0"/>
+      </w:pPr>
+      <w:r>
+        <w:rPr>
+          <w:b/>
+          <w:bCs/>
+        </w:rPr>
+        <w:t xml:space="preserve">Detalhes técnicos do deployment no iPhone (via Xcode):</w:t>
+      </w:r>
+    </w:p>
+    <w:p>
+      <w:pPr>
+        <w:spacing w:after="120" w:before="0"/>
+      </w:pPr>
+      <w:r>
+        <w:t xml:space="preserve">Ao contrário do Android (que empacota a aplicação num APK), no iOS a aplicação é compilada num bundle .app assinado (distribuível como .ipa) e só pode ser instalada num dispositivo físico depois de assinada com um certificado de programador. O processo seguido:</w:t>
+      </w:r>
+    </w:p>
+    <w:p>
+      <w:pPr>
+        <w:pStyle w:val="ListParagraph"/>
+        <w:numPr>
+          <w:ilvl w:val="0"/>
+          <w:numId w:val="1"/>
+        </w:numPr>
+        <w:spacing w:after="60"/>
+      </w:pPr>
+      <w:r>
+        <w:t xml:space="preserve">flutter create --platforms=ios . — gera o projeto Xcode (ios/Runner.xcworkspace); as dependências nativas são geridas pelo CocoaPods;</w:t>
+      </w:r>
+    </w:p>
+    <w:p>
+      <w:pPr>
+        <w:pStyle w:val="ListParagraph"/>
+        <w:numPr>
+          <w:ilvl w:val="0"/>
+          <w:numId w:val="1"/>
+        </w:numPr>
+        <w:spacing w:after="60"/>
+      </w:pPr>
+      <w:r>
+        <w:t xml:space="preserve">No iPhone, ativou-se o Developer Mode (Definições → Privacidade e Segurança) e ligou-se o dispositivo por cabo ao Mac;</w:t>
+      </w:r>
+    </w:p>
+    <w:p>
+      <w:pPr>
+        <w:pStyle w:val="ListParagraph"/>
+        <w:numPr>
+          <w:ilvl w:val="0"/>
+          <w:numId w:val="1"/>
+        </w:numPr>
+        <w:spacing w:after="60"/>
+      </w:pPr>
+      <w:r>
+        <w:t xml:space="preserve">No Xcode (target Runner → Signing &amp; Capabilities): ativou-se Automatically manage signing com a equipa pessoal associada ao Apple ID — o Xcode gera automaticamente o certificado de development e o provisioning profile que autorizam a instalação neste dispositivo (com conta gratuita, o perfil é válido por 7 dias);</w:t>
+      </w:r>
+    </w:p>
+    <w:p>
+      <w:pPr>
+        <w:pStyle w:val="ListParagraph"/>
+        <w:numPr>
+          <w:ilvl w:val="0"/>
+          <w:numId w:val="1"/>
+        </w:numPr>
+        <w:spacing w:after="60"/>
+      </w:pPr>
+      <w:r>
+        <w:t xml:space="preserve">flutter run -d &lt;iPhone&gt; — compila via xcodebuild, assina o .app, instala-o pelo cabo e lança a aplicação; na primeira execução foi necessário confiar no certificado no iPhone (Definições → Geral → VPN e Gestão de Dispositivos);</w:t>
+      </w:r>
+    </w:p>
+    <w:p>
+      <w:pPr>
+        <w:pStyle w:val="ListParagraph"/>
+        <w:numPr>
+          <w:ilvl w:val="0"/>
+          <w:numId w:val="1"/>
+        </w:numPr>
+        <w:spacing w:after="60"/>
+      </w:pPr>
+      <w:r>
+        <w:t xml:space="preserve">Como o dispositivo físico não vê o localhost do Mac, o campo "Servidor" do login foi apontado ao IP do anfitrião na rede local (http://192.168.1.64:7100), com o Mac e o iPhone na mesma rede Wi-Fi (a API Javalin escuta em 0.0.0.0, pelo que aceita ligações de qualquer interface sem reconfiguração).</w:t>
+      </w:r>
+    </w:p>
+    <w:p>
+      <w:pPr>
+        <w:spacing w:after="120" w:before="0"/>
+      </w:pPr>
+      <w:r>
+        <w:rPr>
+          <w:b/>
+          <w:bCs/>
+        </w:rPr>
+        <w:t xml:space="preserve">Notas de configuração encontradas e resolvidas:</w:t>
+      </w:r>
+    </w:p>
+    <w:p>
+      <w:pPr>
+        <w:pStyle w:val="ListParagraph"/>
+        <w:numPr>
+          <w:ilvl w:val="0"/>
+          <w:numId w:val="1"/>
+        </w:numPr>
+        <w:spacing w:after="60"/>
+      </w:pPr>
+      <w:r>
+        <w:t xml:space="preserve">macOS: a aplicação corre em sandbox e bloqueia ligações de saída por omissão. Foi adicionada a entitlement com.apple.security.network.client em macos/Runner/DebugProfile.entitlements e Release.entitlements.</w:t>
+      </w:r>
+    </w:p>
+    <w:p>
+      <w:pPr>
+        <w:pStyle w:val="ListParagraph"/>
+        <w:numPr>
+          <w:ilvl w:val="0"/>
+          <w:numId w:val="1"/>
+        </w:numPr>
+        <w:spacing w:after="60"/>
+      </w:pPr>
+      <w:r>
+        <w:t xml:space="preserve">iOS: o iOS bloqueia HTTP em claro (App Transport Security); foi adicionado NSAllowsArbitraryLoads ao ios/Runner/Info.plist (apenas para testes locais).</w:t>
+      </w:r>
+    </w:p>
+    <w:p>
+      <w:pPr>
+        <w:pStyle w:val="ListParagraph"/>
+        <w:numPr>
+          <w:ilvl w:val="0"/>
+          <w:numId w:val="1"/>
+        </w:numPr>
+        <w:spacing w:after="60"/>
+      </w:pPr>
+      <w:r>
+        <w:t xml:space="preserve">Android: como a API de teste é HTTP (não HTTPS), é necessário android:usesCleartextTraffic="true" no AndroidManifest.xml (já aplicado); a geração do APK correspondente faz-se com flutter build apk --release, exigindo o Android SDK.</w:t>
       </w:r>
     </w:p>
     <w:p>
@@ -3453,7 +3830,7 @@
       <w:r>
         <w:drawing>
           <wp:inline distT="0" distB="0" distL="0" distR="0">
-            <wp:extent cx="5715000" cy="11706225"/>
+            <wp:extent cx="5715000" cy="4533900"/>
             <wp:effectExtent t="0" r="0" b="0" l="0"/>
             <wp:docPr id="1" name="" descr="" title=""/>
             <wp:cNvGraphicFramePr>
@@ -3478,7 +3855,7 @@
                   <pic:spPr bwMode="auto">
                     <a:xfrm>
                       <a:off x="0" y="0"/>
-                      <a:ext cx="5715000" cy="11706225"/>
+                      <a:ext cx="5715000" cy="4533900"/>
                     </a:xfrm>
                     <a:prstGeom prst="rect">
                       <a:avLst/>
@@ -3504,7 +3881,7 @@
           <w:sz w:val="18"/>
           <w:szCs w:val="18"/>
         </w:rPr>
-        <w:t xml:space="preserve">Figura — listas do utilizador no emulador Android</w:t>
+        <w:t xml:space="preserve">Figura — aplicação a correr em Desktop (macOS)</w:t>
       </w:r>
     </w:p>
     <w:p>
@@ -3515,7 +3892,7 @@
       <w:r>
         <w:drawing>
           <wp:inline distT="0" distB="0" distL="0" distR="0">
-            <wp:extent cx="5715000" cy="12411075"/>
+            <wp:extent cx="5715000" cy="9734550"/>
             <wp:effectExtent t="0" r="0" b="0" l="0"/>
             <wp:docPr id="1" name="" descr="" title=""/>
             <wp:cNvGraphicFramePr>
@@ -3540,7 +3917,7 @@
                   <pic:spPr bwMode="auto">
                     <a:xfrm>
                       <a:off x="0" y="0"/>
-                      <a:ext cx="5715000" cy="12411075"/>
+                      <a:ext cx="5715000" cy="9734550"/>
                     </a:xfrm>
                     <a:prstGeom prst="rect">
                       <a:avLst/>
@@ -3566,50 +3943,7 @@
           <w:sz w:val="18"/>
           <w:szCs w:val="18"/>
         </w:rPr>
-        <w:t xml:space="preserve">Figura — login no iPhone físico, com o servidor apontado ao IP do Mac na rede local</w:t>
-      </w:r>
-    </w:p>
-    <w:p>
-      <w:pPr>
-        <w:pStyle w:val="Heading2"/>
-        <w:spacing w:after="120" w:before="240"/>
-      </w:pPr>
-      <w:r>
-        <w:t xml:space="preserve">5.3. b) Marcar tarefas como completas (API + cliente)</w:t>
-      </w:r>
-    </w:p>
-    <w:p>
-      <w:pPr>
-        <w:spacing w:after="120" w:before="0"/>
-      </w:pPr>
-      <w:r>
-        <w:t xml:space="preserve">A funcionalidade foi implementada em toda a stack:</w:t>
-      </w:r>
-    </w:p>
-    <w:p>
-      <w:pPr>
-        <w:pStyle w:val="ListParagraph"/>
-        <w:numPr>
-          <w:ilvl w:val="0"/>
-          <w:numId w:val="1"/>
-        </w:numPr>
-        <w:spacing w:after="60"/>
-      </w:pPr>
-      <w:r>
-        <w:t xml:space="preserve">API: novos endpoints PUT /todo/{listId}/tasks/{taskId}/complete e /incomplete. O TodoController verifica a posse da lista, e o TodoService.setCompleted(...) altera o campo completed e persiste via TodoRepository.update(...) (memória e SQL).</w:t>
-      </w:r>
-    </w:p>
-    <w:p>
-      <w:pPr>
-        <w:pStyle w:val="ListParagraph"/>
-        <w:numPr>
-          <w:ilvl w:val="0"/>
-          <w:numId w:val="1"/>
-        </w:numPr>
-        <w:spacing w:after="60"/>
-      </w:pPr>
-      <w:r>
-        <w:t xml:space="preserve">Cliente: cada tarefa é apresentada com uma checkbox (CheckboxListTile); ao alterá-la, o ApiClient.setCompleted(...) é chamado e a lista é recarregada, mostrando o item riscado quando completo.</w:t>
+        <w:t xml:space="preserve">Figura — login no emulador Android (Pixel 9, API 36), com o endereço 10.0.2.2 resolvido automaticamente</w:t>
       </w:r>
     </w:p>
     <w:p>
@@ -3620,7 +3954,7 @@
       <w:r>
         <w:drawing>
           <wp:inline distT="0" distB="0" distL="0" distR="0">
-            <wp:extent cx="5715000" cy="4543425"/>
+            <wp:extent cx="5715000" cy="11706225"/>
             <wp:effectExtent t="0" r="0" b="0" l="0"/>
             <wp:docPr id="1" name="" descr="" title=""/>
             <wp:cNvGraphicFramePr>
@@ -3645,7 +3979,7 @@
                   <pic:spPr bwMode="auto">
                     <a:xfrm>
                       <a:off x="0" y="0"/>
-                      <a:ext cx="5715000" cy="4543425"/>
+                      <a:ext cx="5715000" cy="11706225"/>
                     </a:xfrm>
                     <a:prstGeom prst="rect">
                       <a:avLst/>
@@ -3671,7 +4005,7 @@
           <w:sz w:val="18"/>
           <w:szCs w:val="18"/>
         </w:rPr>
-        <w:t xml:space="preserve">Figura — tarefas marcadas como completas no Desktop (macOS)</w:t>
+        <w:t xml:space="preserve">Figura — listas do utilizador no emulador Android</w:t>
       </w:r>
     </w:p>
     <w:p>
@@ -3682,7 +4016,7 @@
       <w:r>
         <w:drawing>
           <wp:inline distT="0" distB="0" distL="0" distR="0">
-            <wp:extent cx="5715000" cy="11791950"/>
+            <wp:extent cx="5715000" cy="12411075"/>
             <wp:effectExtent t="0" r="0" b="0" l="0"/>
             <wp:docPr id="1" name="" descr="" title=""/>
             <wp:cNvGraphicFramePr>
@@ -3707,6 +4041,173 @@
                   <pic:spPr bwMode="auto">
                     <a:xfrm>
                       <a:off x="0" y="0"/>
+                      <a:ext cx="5715000" cy="12411075"/>
+                    </a:xfrm>
+                    <a:prstGeom prst="rect">
+                      <a:avLst/>
+                    </a:prstGeom>
+                  </pic:spPr>
+                </pic:pic>
+              </a:graphicData>
+            </a:graphic>
+          </wp:inline>
+        </w:drawing>
+      </w:r>
+    </w:p>
+    <w:p>
+      <w:pPr>
+        <w:spacing w:after="180"/>
+        <w:jc w:val="center"/>
+      </w:pPr>
+      <w:r>
+        <w:rPr>
+          <w:i/>
+          <w:iCs/>
+          <w:color w:val="666666"/>
+          <w:sz w:val="18"/>
+          <w:szCs w:val="18"/>
+        </w:rPr>
+        <w:t xml:space="preserve">Figura — login no iPhone físico, com o servidor apontado ao IP do Mac na rede local</w:t>
+      </w:r>
+    </w:p>
+    <w:p>
+      <w:pPr>
+        <w:pStyle w:val="Heading2"/>
+        <w:spacing w:after="120" w:before="240"/>
+      </w:pPr>
+      <w:r>
+        <w:t xml:space="preserve">5.3. b) Marcar tarefas como completas (API + cliente)</w:t>
+      </w:r>
+    </w:p>
+    <w:p>
+      <w:pPr>
+        <w:spacing w:after="120" w:before="0"/>
+      </w:pPr>
+      <w:r>
+        <w:t xml:space="preserve">A funcionalidade foi implementada em toda a stack:</w:t>
+      </w:r>
+    </w:p>
+    <w:p>
+      <w:pPr>
+        <w:pStyle w:val="ListParagraph"/>
+        <w:numPr>
+          <w:ilvl w:val="0"/>
+          <w:numId w:val="1"/>
+        </w:numPr>
+        <w:spacing w:after="60"/>
+      </w:pPr>
+      <w:r>
+        <w:t xml:space="preserve">API: novos endpoints PUT /todo/{listId}/tasks/{taskId}/complete e /incomplete. O TodoController verifica a posse da lista, e o TodoService.setCompleted(...) altera o campo completed e persiste via TodoRepository.update(...) (memória e SQL).</w:t>
+      </w:r>
+    </w:p>
+    <w:p>
+      <w:pPr>
+        <w:pStyle w:val="ListParagraph"/>
+        <w:numPr>
+          <w:ilvl w:val="0"/>
+          <w:numId w:val="1"/>
+        </w:numPr>
+        <w:spacing w:after="60"/>
+      </w:pPr>
+      <w:r>
+        <w:t xml:space="preserve">Cliente: cada tarefa é apresentada com uma checkbox (CheckboxListTile); ao alterá-la, o ApiClient.setCompleted(...) é chamado e a lista é recarregada, mostrando o item riscado quando completo.</w:t>
+      </w:r>
+    </w:p>
+    <w:p>
+      <w:pPr>
+        <w:spacing w:after="60" w:before="100"/>
+        <w:jc w:val="center"/>
+      </w:pPr>
+      <w:r>
+        <w:drawing>
+          <wp:inline distT="0" distB="0" distL="0" distR="0">
+            <wp:extent cx="5715000" cy="4543425"/>
+            <wp:effectExtent t="0" r="0" b="0" l="0"/>
+            <wp:docPr id="1" name="" descr="" title=""/>
+            <wp:cNvGraphicFramePr>
+              <a:graphicFrameLocks xmlns:a="http://schemas.openxmlformats.org/drawingml/2006/main" noChangeAspect="1"/>
+            </wp:cNvGraphicFramePr>
+            <a:graphic xmlns:a="http://schemas.openxmlformats.org/drawingml/2006/main">
+              <a:graphicData uri="http://schemas.openxmlformats.org/drawingml/2006/picture">
+                <pic:pic xmlns:pic="http://schemas.openxmlformats.org/drawingml/2006/picture">
+                  <pic:nvPicPr>
+                    <pic:cNvPr id="0" name="" descr=""/>
+                    <pic:cNvPicPr>
+                      <a:picLocks noChangeAspect="1" noChangeArrowheads="1"/>
+                    </pic:cNvPicPr>
+                  </pic:nvPicPr>
+                  <pic:blipFill>
+                    <a:blip r:embed="rId18" cstate="none"/>
+                    <a:srcRect/>
+                    <a:stretch>
+                      <a:fillRect/>
+                    </a:stretch>
+                  </pic:blipFill>
+                  <pic:spPr bwMode="auto">
+                    <a:xfrm>
+                      <a:off x="0" y="0"/>
+                      <a:ext cx="5715000" cy="4543425"/>
+                    </a:xfrm>
+                    <a:prstGeom prst="rect">
+                      <a:avLst/>
+                    </a:prstGeom>
+                  </pic:spPr>
+                </pic:pic>
+              </a:graphicData>
+            </a:graphic>
+          </wp:inline>
+        </w:drawing>
+      </w:r>
+    </w:p>
+    <w:p>
+      <w:pPr>
+        <w:spacing w:after="180"/>
+        <w:jc w:val="center"/>
+      </w:pPr>
+      <w:r>
+        <w:rPr>
+          <w:i/>
+          <w:iCs/>
+          <w:color w:val="666666"/>
+          <w:sz w:val="18"/>
+          <w:szCs w:val="18"/>
+        </w:rPr>
+        <w:t xml:space="preserve">Figura — tarefas marcadas como completas no Desktop (macOS)</w:t>
+      </w:r>
+    </w:p>
+    <w:p>
+      <w:pPr>
+        <w:spacing w:after="60" w:before="100"/>
+        <w:jc w:val="center"/>
+      </w:pPr>
+      <w:r>
+        <w:drawing>
+          <wp:inline distT="0" distB="0" distL="0" distR="0">
+            <wp:extent cx="5715000" cy="11791950"/>
+            <wp:effectExtent t="0" r="0" b="0" l="0"/>
+            <wp:docPr id="1" name="" descr="" title=""/>
+            <wp:cNvGraphicFramePr>
+              <a:graphicFrameLocks xmlns:a="http://schemas.openxmlformats.org/drawingml/2006/main" noChangeAspect="1"/>
+            </wp:cNvGraphicFramePr>
+            <a:graphic xmlns:a="http://schemas.openxmlformats.org/drawingml/2006/main">
+              <a:graphicData uri="http://schemas.openxmlformats.org/drawingml/2006/picture">
+                <pic:pic xmlns:pic="http://schemas.openxmlformats.org/drawingml/2006/picture">
+                  <pic:nvPicPr>
+                    <pic:cNvPr id="0" name="" descr=""/>
+                    <pic:cNvPicPr>
+                      <a:picLocks noChangeAspect="1" noChangeArrowheads="1"/>
+                    </pic:cNvPicPr>
+                  </pic:nvPicPr>
+                  <pic:blipFill>
+                    <a:blip r:embed="rId19" cstate="none"/>
+                    <a:srcRect/>
+                    <a:stretch>
+                      <a:fillRect/>
+                    </a:stretch>
+                  </pic:blipFill>
+                  <pic:spPr bwMode="auto">
+                    <a:xfrm>
+                      <a:off x="0" y="0"/>
                       <a:ext cx="5715000" cy="11791950"/>
                     </a:xfrm>
                     <a:prstGeom prst="rect">
@@ -3760,7 +4261,7 @@
                     </pic:cNvPicPr>
                   </pic:nvPicPr>
                   <pic:blipFill>
-                    <a:blip r:embed="rId18" cstate="none"/>
+                    <a:blip r:embed="rId20" cstate="none"/>
                     <a:srcRect/>
                     <a:stretch>
                       <a:fillRect/>

</xml_diff>